<commit_message>
Task 3: use 256 threads/block for multiple blocks; fill report with student details, Colab links and run screenshots
</commit_message>
<xml_diff>
--- a/Evidence/Report/6CS005_Report.docx
+++ b/Evidence/Report/6CS005_Report.docx
@@ -46,12 +46,7 @@
         <w:t xml:space="preserve">Full name:  </w:t>
       </w:r>
       <w:r>
-        <w:rPr>
-          <w:i/>
-          <w:iCs/>
-          <w:color w:val="C00000"/>
-        </w:rPr>
-        <w:t xml:space="preserve">[YOUR NAME]</w:t>
+        <w:t xml:space="preserve">M.W.V.D.M.J. Wijewickrama</w:t>
       </w:r>
     </w:p>
     <w:p>
@@ -66,12 +61,7 @@
         <w:t xml:space="preserve">Wolverhampton ID:  </w:t>
       </w:r>
       <w:r>
-        <w:rPr>
-          <w:i/>
-          <w:iCs/>
-          <w:color w:val="C00000"/>
-        </w:rPr>
-        <w:t xml:space="preserve">[YOUR STUDENT ID]</w:t>
+        <w:t xml:space="preserve">2642837</w:t>
       </w:r>
     </w:p>
     <w:p>
@@ -86,11 +76,6 @@
         <w:t xml:space="preserve">Module:  </w:t>
       </w:r>
       <w:r>
-        <w:rPr>
-          <w:i/>
-          <w:iCs/>
-          <w:color w:val="C00000"/>
-        </w:rPr>
         <w:t xml:space="preserve">6CS005 High Performance Computing — Semester 1, 2025/26</w:t>
       </w:r>
     </w:p>
@@ -106,12 +91,7 @@
         <w:t xml:space="preserve">Submission date:  </w:t>
       </w:r>
       <w:r>
-        <w:rPr>
-          <w:i/>
-          <w:iCs/>
-          <w:color w:val="C00000"/>
-        </w:rPr>
-        <w:t xml:space="preserve">[DATE]</w:t>
+        <w:t xml:space="preserve">11 October 2026</w:t>
       </w:r>
     </w:p>
     <w:p>
@@ -159,7 +139,7 @@
         <w:spacing w:after="120"/>
       </w:pPr>
       <w:r>
-        <w:t xml:space="preserve">Each task was run in Google Colab so that it could be demonstrated and evidenced. The notebooks download their own data with wget from a public GitHub repository, which means anyone opening the shared link can run a task from start to finish without uploading anything; this is why a shareable Colab URL is given at the top of each section below. Tasks 3 and 4 were run on Colab's GPU runtime (nvcc), and Tasks 1 and 2 on the standard CPU runtime (gcc).</w:t>
+        <w:t xml:space="preserve">Each task was run in Google Colab so that it could be demonstrated and evidenced. The notebooks download their own data with wget from a public GitHub repository, which means anyone opening the shared link can run a task from start to finish without uploading anything. Tasks 3 and 4 were run on Colab's GPU runtime (an NVIDIA Tesla T4 with nvcc), and Tasks 1 and 2 on the standard CPU runtime (gcc).</w:t>
       </w:r>
     </w:p>
     <w:p>
@@ -282,23 +262,23 @@
     </w:p>
     <w:p>
       <w:pPr>
-        <w:spacing w:after="40"/>
+        <w:spacing w:after="120"/>
       </w:pPr>
       <w:r>
         <w:rPr>
           <w:b/>
           <w:bCs/>
         </w:rPr>
-        <w:t xml:space="preserve">Colab URL:  </w:t>
-      </w:r>
-      <w:r>
-        <w:rPr>
-          <w:i/>
-          <w:iCs/>
-          <w:color w:val="C00000"/>
-        </w:rPr>
-        <w:t xml:space="preserve">[PASTE THE 'ANYONE WITH THE LINK – VIEWER' COLAB LINK FOR Task 1]</w:t>
-      </w:r>
+        <w:t xml:space="preserve">Colab URL (Anyone with the link – Viewer):  </w:t>
+      </w:r>
+      <w:hyperlink w:history="1" r:id="rId7x7dj7ivzmdgajiv44sib">
+        <w:r>
+          <w:rPr>
+            <w:rStyle w:val="Hyperlink"/>
+          </w:rPr>
+          <w:t xml:space="preserve">https://colab.research.google.com/drive/1xA8vyVNMj-vVQi5CQmWfQW9R3mASc_dd?usp=sharing</w:t>
+        </w:r>
+      </w:hyperlink>
     </w:p>
     <w:p>
       <w:pPr>
@@ -335,7 +315,7 @@
         <w:spacing w:after="120"/>
       </w:pPr>
       <w:r>
-        <w:t xml:space="preserve">Work is divided by word index rather than by byte position. Each thread is given a contiguous range of the word array to process: every thread receives the same base number of words, and the remainder (when the total does not divide evenly) is spread one word at a time across the first few threads. This guarantees the thread loads differ by at most one word, which is as balanced as the division can be, and because the split is on whole words a word can never be cut in half across a boundary. The start and finish index assigned to each thread is printed at run time, showing that the slicing is computed dynamically from the requested thread count rather than fixed in advance. Each thread's range is passed to it through a small argument struct, following the week-1 workshop pattern.</w:t>
+        <w:t xml:space="preserve">Work is divided by word index rather than by byte position. Each thread is given a contiguous range of the word array to process: every thread receives the same base number of words, and the remainder (when the total does not divide evenly) is spread one word at a time across the first few threads. This guarantees the thread loads differ by at most one word, which is as balanced as the division can be, and because the split is on whole words a word can never be cut in half across a boundary. The start and finish index assigned to each thread is printed at run time, showing that the slicing is computed dynamically from the requested thread count rather than fixed in advance.</w:t>
       </w:r>
     </w:p>
     <w:p>
@@ -362,40 +342,122 @@
     </w:p>
     <w:p>
       <w:pPr>
-        <w:pBdr>
-          <w:top w:val="dashed" w:color="595959" w:sz="6"/>
-          <w:left w:val="dashed" w:color="595959" w:sz="6"/>
-          <w:bottom w:val="dashed" w:color="595959" w:sz="6"/>
-          <w:right w:val="dashed" w:color="595959" w:sz="6"/>
-        </w:pBdr>
-        <w:spacing w:after="140" w:before="80"/>
+        <w:spacing w:after="20" w:before="80"/>
+      </w:pPr>
+      <w:r>
+        <w:drawing>
+          <wp:inline distT="0" distB="0" distL="0" distR="0">
+            <wp:extent cx="5715000" cy="1371600"/>
+            <wp:effectExtent t="0" r="0" b="0" l="0"/>
+            <wp:docPr id="1" name="" descr="" title=""/>
+            <wp:cNvGraphicFramePr>
+              <a:graphicFrameLocks xmlns:a="http://schemas.openxmlformats.org/drawingml/2006/main" noChangeAspect="1"/>
+            </wp:cNvGraphicFramePr>
+            <a:graphic xmlns:a="http://schemas.openxmlformats.org/drawingml/2006/main">
+              <a:graphicData uri="http://schemas.openxmlformats.org/drawingml/2006/picture">
+                <pic:pic xmlns:pic="http://schemas.openxmlformats.org/drawingml/2006/picture">
+                  <pic:nvPicPr>
+                    <pic:cNvPr id="0" name="" descr=""/>
+                    <pic:cNvPicPr>
+                      <a:picLocks noChangeAspect="1" noChangeArrowheads="1"/>
+                    </pic:cNvPicPr>
+                  </pic:nvPicPr>
+                  <pic:blipFill>
+                    <a:blip r:embed="rId11" cstate="none"/>
+                    <a:srcRect/>
+                    <a:stretch>
+                      <a:fillRect/>
+                    </a:stretch>
+                  </pic:blipFill>
+                  <pic:spPr bwMode="auto">
+                    <a:xfrm>
+                      <a:off x="0" y="0"/>
+                      <a:ext cx="5715000" cy="1371600"/>
+                    </a:xfrm>
+                    <a:prstGeom prst="rect">
+                      <a:avLst/>
+                    </a:prstGeom>
+                  </pic:spPr>
+                </pic:pic>
+              </a:graphicData>
+            </a:graphic>
+          </wp:inline>
+        </w:drawing>
+      </w:r>
+    </w:p>
+    <w:p>
+      <w:pPr>
+        <w:spacing w:after="160"/>
       </w:pPr>
       <w:r>
         <w:rPr>
           <w:i/>
           <w:iCs/>
-          <w:color w:val="C00000"/>
-        </w:rPr>
-        <w:t xml:space="preserve">[ SCREENSHOT — Colab cell: gcc compiling wordcount.c with no errors ]</w:t>
-      </w:r>
-    </w:p>
-    <w:p>
-      <w:pPr>
-        <w:pBdr>
-          <w:top w:val="dashed" w:color="595959" w:sz="6"/>
-          <w:left w:val="dashed" w:color="595959" w:sz="6"/>
-          <w:bottom w:val="dashed" w:color="595959" w:sz="6"/>
-          <w:right w:val="dashed" w:color="595959" w:sz="6"/>
-        </w:pBdr>
-        <w:spacing w:after="140" w:before="80"/>
+          <w:color w:val="595959"/>
+          <w:sz w:val="18"/>
+          <w:szCs w:val="18"/>
+        </w:rPr>
+        <w:t xml:space="preserve">Figure 1.1 — Compiling wordcount.c with gcc and -lpthread, with no errors.</w:t>
+      </w:r>
+    </w:p>
+    <w:p>
+      <w:pPr>
+        <w:spacing w:after="20" w:before="80"/>
+      </w:pPr>
+      <w:r>
+        <w:drawing>
+          <wp:inline distT="0" distB="0" distL="0" distR="0">
+            <wp:extent cx="5715000" cy="2152650"/>
+            <wp:effectExtent t="0" r="0" b="0" l="0"/>
+            <wp:docPr id="2" name="" descr="" title=""/>
+            <wp:cNvGraphicFramePr>
+              <a:graphicFrameLocks xmlns:a="http://schemas.openxmlformats.org/drawingml/2006/main" noChangeAspect="1"/>
+            </wp:cNvGraphicFramePr>
+            <a:graphic xmlns:a="http://schemas.openxmlformats.org/drawingml/2006/main">
+              <a:graphicData uri="http://schemas.openxmlformats.org/drawingml/2006/picture">
+                <pic:pic xmlns:pic="http://schemas.openxmlformats.org/drawingml/2006/picture">
+                  <pic:nvPicPr>
+                    <pic:cNvPr id="0" name="" descr=""/>
+                    <pic:cNvPicPr>
+                      <a:picLocks noChangeAspect="1" noChangeArrowheads="1"/>
+                    </pic:cNvPicPr>
+                  </pic:nvPicPr>
+                  <pic:blipFill>
+                    <a:blip r:embed="rId12" cstate="none"/>
+                    <a:srcRect/>
+                    <a:stretch>
+                      <a:fillRect/>
+                    </a:stretch>
+                  </pic:blipFill>
+                  <pic:spPr bwMode="auto">
+                    <a:xfrm>
+                      <a:off x="0" y="0"/>
+                      <a:ext cx="5715000" cy="2152650"/>
+                    </a:xfrm>
+                    <a:prstGeom prst="rect">
+                      <a:avLst/>
+                    </a:prstGeom>
+                  </pic:spPr>
+                </pic:pic>
+              </a:graphicData>
+            </a:graphic>
+          </wp:inline>
+        </w:drawing>
+      </w:r>
+    </w:p>
+    <w:p>
+      <w:pPr>
+        <w:spacing w:after="160"/>
       </w:pPr>
       <w:r>
         <w:rPr>
           <w:i/>
           <w:iCs/>
-          <w:color w:val="C00000"/>
-        </w:rPr>
-        <w:t xml:space="preserve">[ SCREENSHOT — Colab cell: ./wordcount running, showing the per-thread start/finish word ranges ]</w:t>
+          <w:color w:val="595959"/>
+          <w:sz w:val="18"/>
+          <w:szCs w:val="18"/>
+        </w:rPr>
+        <w:t xml:space="preserve">Figure 1.2 — Running with four threads; each thread's start/finish word range is printed, and the per-thread counts sum back to the file's 120,000 words.</w:t>
       </w:r>
     </w:p>
     <w:p>
@@ -422,21 +484,62 @@
     </w:p>
     <w:p>
       <w:pPr>
-        <w:pBdr>
-          <w:top w:val="dashed" w:color="595959" w:sz="6"/>
-          <w:left w:val="dashed" w:color="595959" w:sz="6"/>
-          <w:bottom w:val="dashed" w:color="595959" w:sz="6"/>
-          <w:right w:val="dashed" w:color="595959" w:sz="6"/>
-        </w:pBdr>
-        <w:spacing w:after="140" w:before="80"/>
+        <w:spacing w:after="20" w:before="80"/>
+      </w:pPr>
+      <w:r>
+        <w:drawing>
+          <wp:inline distT="0" distB="0" distL="0" distR="0">
+            <wp:extent cx="5715000" cy="2838450"/>
+            <wp:effectExtent t="0" r="0" b="0" l="0"/>
+            <wp:docPr id="3" name="" descr="" title=""/>
+            <wp:cNvGraphicFramePr>
+              <a:graphicFrameLocks xmlns:a="http://schemas.openxmlformats.org/drawingml/2006/main" noChangeAspect="1"/>
+            </wp:cNvGraphicFramePr>
+            <a:graphic xmlns:a="http://schemas.openxmlformats.org/drawingml/2006/main">
+              <a:graphicData uri="http://schemas.openxmlformats.org/drawingml/2006/picture">
+                <pic:pic xmlns:pic="http://schemas.openxmlformats.org/drawingml/2006/picture">
+                  <pic:nvPicPr>
+                    <pic:cNvPr id="0" name="" descr=""/>
+                    <pic:cNvPicPr>
+                      <a:picLocks noChangeAspect="1" noChangeArrowheads="1"/>
+                    </pic:cNvPicPr>
+                  </pic:nvPicPr>
+                  <pic:blipFill>
+                    <a:blip r:embed="rId13" cstate="none"/>
+                    <a:srcRect/>
+                    <a:stretch>
+                      <a:fillRect/>
+                    </a:stretch>
+                  </pic:blipFill>
+                  <pic:spPr bwMode="auto">
+                    <a:xfrm>
+                      <a:off x="0" y="0"/>
+                      <a:ext cx="5715000" cy="2838450"/>
+                    </a:xfrm>
+                    <a:prstGeom prst="rect">
+                      <a:avLst/>
+                    </a:prstGeom>
+                  </pic:spPr>
+                </pic:pic>
+              </a:graphicData>
+            </a:graphic>
+          </wp:inline>
+        </w:drawing>
+      </w:r>
+    </w:p>
+    <w:p>
+      <w:pPr>
+        <w:spacing w:after="160"/>
       </w:pPr>
       <w:r>
         <w:rPr>
           <w:i/>
           <w:iCs/>
-          <w:color w:val="C00000"/>
-        </w:rPr>
-        <w:t xml:space="preserve">[ SCREENSHOT — head of result.txt showing the most frequent words and their counts ]</w:t>
+          <w:color w:val="595959"/>
+          <w:sz w:val="18"/>
+          <w:szCs w:val="18"/>
+        </w:rPr>
+        <w:t xml:space="preserve">Figure 1.3 — The head of result.txt: 94 unique words across 120,000 total, sorted by frequency.</w:t>
       </w:r>
     </w:p>
     <w:p>
@@ -463,21 +566,62 @@
     </w:p>
     <w:p>
       <w:pPr>
-        <w:pBdr>
-          <w:top w:val="dashed" w:color="595959" w:sz="6"/>
-          <w:left w:val="dashed" w:color="595959" w:sz="6"/>
-          <w:bottom w:val="dashed" w:color="595959" w:sz="6"/>
-          <w:right w:val="dashed" w:color="595959" w:sz="6"/>
-        </w:pBdr>
-        <w:spacing w:after="140" w:before="80"/>
+        <w:spacing w:after="20" w:before="80"/>
+      </w:pPr>
+      <w:r>
+        <w:drawing>
+          <wp:inline distT="0" distB="0" distL="0" distR="0">
+            <wp:extent cx="5715000" cy="1524000"/>
+            <wp:effectExtent t="0" r="0" b="0" l="0"/>
+            <wp:docPr id="4" name="" descr="" title=""/>
+            <wp:cNvGraphicFramePr>
+              <a:graphicFrameLocks xmlns:a="http://schemas.openxmlformats.org/drawingml/2006/main" noChangeAspect="1"/>
+            </wp:cNvGraphicFramePr>
+            <a:graphic xmlns:a="http://schemas.openxmlformats.org/drawingml/2006/main">
+              <a:graphicData uri="http://schemas.openxmlformats.org/drawingml/2006/picture">
+                <pic:pic xmlns:pic="http://schemas.openxmlformats.org/drawingml/2006/picture">
+                  <pic:nvPicPr>
+                    <pic:cNvPr id="0" name="" descr=""/>
+                    <pic:cNvPicPr>
+                      <a:picLocks noChangeAspect="1" noChangeArrowheads="1"/>
+                    </pic:cNvPicPr>
+                  </pic:nvPicPr>
+                  <pic:blipFill>
+                    <a:blip r:embed="rId14" cstate="none"/>
+                    <a:srcRect/>
+                    <a:stretch>
+                      <a:fillRect/>
+                    </a:stretch>
+                  </pic:blipFill>
+                  <pic:spPr bwMode="auto">
+                    <a:xfrm>
+                      <a:off x="0" y="0"/>
+                      <a:ext cx="5715000" cy="1524000"/>
+                    </a:xfrm>
+                    <a:prstGeom prst="rect">
+                      <a:avLst/>
+                    </a:prstGeom>
+                  </pic:spPr>
+                </pic:pic>
+              </a:graphicData>
+            </a:graphic>
+          </wp:inline>
+        </w:drawing>
+      </w:r>
+    </w:p>
+    <w:p>
+      <w:pPr>
+        <w:spacing w:after="160"/>
       </w:pPr>
       <w:r>
         <w:rPr>
           <w:i/>
           <w:iCs/>
-          <w:color w:val="C00000"/>
-        </w:rPr>
-        <w:t xml:space="preserve">[ SCREENSHOT — the 1-thread vs 4-thread comparison reporting identical counts ]</w:t>
+          <w:color w:val="595959"/>
+          <w:sz w:val="18"/>
+          <w:szCs w:val="18"/>
+        </w:rPr>
+        <w:t xml:space="preserve">Figure 1.4 — The 1-thread and 4-thread runs produce identical counts.</w:t>
       </w:r>
     </w:p>
     <w:tbl>
@@ -710,23 +854,23 @@
     </w:p>
     <w:p>
       <w:pPr>
-        <w:spacing w:after="40"/>
+        <w:spacing w:after="120"/>
       </w:pPr>
       <w:r>
         <w:rPr>
           <w:b/>
           <w:bCs/>
         </w:rPr>
-        <w:t xml:space="preserve">Colab URL:  </w:t>
-      </w:r>
-      <w:r>
-        <w:rPr>
-          <w:i/>
-          <w:iCs/>
-          <w:color w:val="C00000"/>
-        </w:rPr>
-        <w:t xml:space="preserve">[PASTE THE 'ANYONE WITH THE LINK – VIEWER' COLAB LINK FOR Task 2]</w:t>
-      </w:r>
+        <w:t xml:space="preserve">Colab URL (Anyone with the link – Viewer):  </w:t>
+      </w:r>
+      <w:hyperlink w:history="1" r:id="rId2cdqkq5tna1fx7p1swpc5">
+        <w:r>
+          <w:rPr>
+            <w:rStyle w:val="Hyperlink"/>
+          </w:rPr>
+          <w:t xml:space="preserve">https://colab.research.google.com/drive/1Wt22OQEA7ndzGVS6xKKPHPgDSanMR-Xf?usp=sharing</w:t>
+        </w:r>
+      </w:hyperlink>
     </w:p>
     <w:p>
       <w:pPr>
@@ -760,40 +904,182 @@
     </w:p>
     <w:p>
       <w:pPr>
-        <w:pBdr>
-          <w:top w:val="dashed" w:color="595959" w:sz="6"/>
-          <w:left w:val="dashed" w:color="595959" w:sz="6"/>
-          <w:bottom w:val="dashed" w:color="595959" w:sz="6"/>
-          <w:right w:val="dashed" w:color="595959" w:sz="6"/>
-        </w:pBdr>
-        <w:spacing w:after="140" w:before="80"/>
+        <w:spacing w:after="20" w:before="80"/>
+      </w:pPr>
+      <w:r>
+        <w:drawing>
+          <wp:inline distT="0" distB="0" distL="0" distR="0">
+            <wp:extent cx="5715000" cy="1304925"/>
+            <wp:effectExtent t="0" r="0" b="0" l="0"/>
+            <wp:docPr id="5" name="" descr="" title=""/>
+            <wp:cNvGraphicFramePr>
+              <a:graphicFrameLocks xmlns:a="http://schemas.openxmlformats.org/drawingml/2006/main" noChangeAspect="1"/>
+            </wp:cNvGraphicFramePr>
+            <a:graphic xmlns:a="http://schemas.openxmlformats.org/drawingml/2006/main">
+              <a:graphicData uri="http://schemas.openxmlformats.org/drawingml/2006/picture">
+                <pic:pic xmlns:pic="http://schemas.openxmlformats.org/drawingml/2006/picture">
+                  <pic:nvPicPr>
+                    <pic:cNvPr id="0" name="" descr=""/>
+                    <pic:cNvPicPr>
+                      <a:picLocks noChangeAspect="1" noChangeArrowheads="1"/>
+                    </pic:cNvPicPr>
+                  </pic:nvPicPr>
+                  <pic:blipFill>
+                    <a:blip r:embed="rId15" cstate="none"/>
+                    <a:srcRect/>
+                    <a:stretch>
+                      <a:fillRect/>
+                    </a:stretch>
+                  </pic:blipFill>
+                  <pic:spPr bwMode="auto">
+                    <a:xfrm>
+                      <a:off x="0" y="0"/>
+                      <a:ext cx="5715000" cy="1304925"/>
+                    </a:xfrm>
+                    <a:prstGeom prst="rect">
+                      <a:avLst/>
+                    </a:prstGeom>
+                  </pic:spPr>
+                </pic:pic>
+              </a:graphicData>
+            </a:graphic>
+          </wp:inline>
+        </w:drawing>
+      </w:r>
+    </w:p>
+    <w:p>
+      <w:pPr>
+        <w:spacing w:after="160"/>
       </w:pPr>
       <w:r>
         <w:rPr>
           <w:i/>
           <w:iCs/>
-          <w:color w:val="C00000"/>
-        </w:rPr>
-        <w:t xml:space="preserve">[ SCREENSHOT — Colab cell: gcc -fopenmp compiling matrices.c ]</w:t>
-      </w:r>
-    </w:p>
-    <w:p>
-      <w:pPr>
-        <w:pBdr>
-          <w:top w:val="dashed" w:color="595959" w:sz="6"/>
-          <w:left w:val="dashed" w:color="595959" w:sz="6"/>
-          <w:bottom w:val="dashed" w:color="595959" w:sz="6"/>
-          <w:right w:val="dashed" w:color="595959" w:sz="6"/>
-        </w:pBdr>
-        <w:spacing w:after="140" w:before="80"/>
+          <w:color w:val="595959"/>
+          <w:sz w:val="18"/>
+          <w:szCs w:val="18"/>
+        </w:rPr>
+        <w:t xml:space="preserve">Figure 2.1 — Compiling matrices.c with gcc and -fopenmp.</w:t>
+      </w:r>
+    </w:p>
+    <w:p>
+      <w:pPr>
+        <w:spacing w:after="20" w:before="80"/>
+      </w:pPr>
+      <w:r>
+        <w:drawing>
+          <wp:inline distT="0" distB="0" distL="0" distR="0">
+            <wp:extent cx="5715000" cy="4124325"/>
+            <wp:effectExtent t="0" r="0" b="0" l="0"/>
+            <wp:docPr id="6" name="" descr="" title=""/>
+            <wp:cNvGraphicFramePr>
+              <a:graphicFrameLocks xmlns:a="http://schemas.openxmlformats.org/drawingml/2006/main" noChangeAspect="1"/>
+            </wp:cNvGraphicFramePr>
+            <a:graphic xmlns:a="http://schemas.openxmlformats.org/drawingml/2006/main">
+              <a:graphicData uri="http://schemas.openxmlformats.org/drawingml/2006/picture">
+                <pic:pic xmlns:pic="http://schemas.openxmlformats.org/drawingml/2006/picture">
+                  <pic:nvPicPr>
+                    <pic:cNvPr id="0" name="" descr=""/>
+                    <pic:cNvPicPr>
+                      <a:picLocks noChangeAspect="1" noChangeArrowheads="1"/>
+                    </pic:cNvPicPr>
+                  </pic:nvPicPr>
+                  <pic:blipFill>
+                    <a:blip r:embed="rId16" cstate="none"/>
+                    <a:srcRect/>
+                    <a:stretch>
+                      <a:fillRect/>
+                    </a:stretch>
+                  </pic:blipFill>
+                  <pic:spPr bwMode="auto">
+                    <a:xfrm>
+                      <a:off x="0" y="0"/>
+                      <a:ext cx="5715000" cy="4124325"/>
+                    </a:xfrm>
+                    <a:prstGeom prst="rect">
+                      <a:avLst/>
+                    </a:prstGeom>
+                  </pic:spPr>
+                </pic:pic>
+              </a:graphicData>
+            </a:graphic>
+          </wp:inline>
+        </w:drawing>
+      </w:r>
+    </w:p>
+    <w:p>
+      <w:pPr>
+        <w:spacing w:after="160"/>
       </w:pPr>
       <w:r>
         <w:rPr>
           <w:i/>
           <w:iCs/>
-          <w:color w:val="C00000"/>
-        </w:rPr>
-        <w:t xml:space="preserve">[ SCREENSHOT — Colab cell: ./matrices running across all 25 pairs with per-operation timings ]</w:t>
+          <w:color w:val="595959"/>
+          <w:sz w:val="18"/>
+          <w:szCs w:val="18"/>
+        </w:rPr>
+        <w:t xml:space="preserve">Figure 2.2 — Running across the dataset with four threads; each operation is timed.</w:t>
+      </w:r>
+    </w:p>
+    <w:p>
+      <w:pPr>
+        <w:spacing w:after="20" w:before="80"/>
+      </w:pPr>
+      <w:r>
+        <w:drawing>
+          <wp:inline distT="0" distB="0" distL="0" distR="0">
+            <wp:extent cx="5715000" cy="5867400"/>
+            <wp:effectExtent t="0" r="0" b="0" l="0"/>
+            <wp:docPr id="7" name="" descr="" title=""/>
+            <wp:cNvGraphicFramePr>
+              <a:graphicFrameLocks xmlns:a="http://schemas.openxmlformats.org/drawingml/2006/main" noChangeAspect="1"/>
+            </wp:cNvGraphicFramePr>
+            <a:graphic xmlns:a="http://schemas.openxmlformats.org/drawingml/2006/main">
+              <a:graphicData uri="http://schemas.openxmlformats.org/drawingml/2006/picture">
+                <pic:pic xmlns:pic="http://schemas.openxmlformats.org/drawingml/2006/picture">
+                  <pic:nvPicPr>
+                    <pic:cNvPr id="0" name="" descr=""/>
+                    <pic:cNvPicPr>
+                      <a:picLocks noChangeAspect="1" noChangeArrowheads="1"/>
+                    </pic:cNvPicPr>
+                  </pic:nvPicPr>
+                  <pic:blipFill>
+                    <a:blip r:embed="rId17" cstate="none"/>
+                    <a:srcRect/>
+                    <a:stretch>
+                      <a:fillRect/>
+                    </a:stretch>
+                  </pic:blipFill>
+                  <pic:spPr bwMode="auto">
+                    <a:xfrm>
+                      <a:off x="0" y="0"/>
+                      <a:ext cx="5715000" cy="5867400"/>
+                    </a:xfrm>
+                    <a:prstGeom prst="rect">
+                      <a:avLst/>
+                    </a:prstGeom>
+                  </pic:spPr>
+                </pic:pic>
+              </a:graphicData>
+            </a:graphic>
+          </wp:inline>
+        </w:drawing>
+      </w:r>
+    </w:p>
+    <w:p>
+      <w:pPr>
+        <w:spacing w:after="160"/>
+      </w:pPr>
+      <w:r>
+        <w:rPr>
+          <w:i/>
+          <w:iCs/>
+          <w:color w:val="595959"/>
+          <w:sz w:val="18"/>
+          <w:szCs w:val="18"/>
+        </w:rPr>
+        <w:t xml:space="preserve">Figure 2.3 — The run completes all 25 pairs.</w:t>
       </w:r>
     </w:p>
     <w:p>
@@ -837,26 +1123,127 @@
         <w:spacing w:after="120"/>
       </w:pPr>
       <w:r>
-        <w:t xml:space="preserve">Each operation is parallelised with a #pragma omp parallel for. The element-wise operations and the transposes use collapse(2) so the two nested loops are flattened into a single iteration space for the threads to share, and the matrix product parallelises its outer row loop with the inner index and accumulator variables marked private so each thread sums its own dot products. The number of threads actually used is capped: if the user asks for more threads than the largest relevant dimension, the count is reduced to that dimension, so the program never spawns threads that would have no rows to work on. Each operation is timed with omp_get_wtime, and the results — each labelled with its name and its dimensions, followed by the comma-separated values — are written to a single results.txt in which the pairs are clearly separated, the single-file option the brief allows.</w:t>
-      </w:r>
-    </w:p>
-    <w:p>
-      <w:pPr>
-        <w:pBdr>
-          <w:top w:val="dashed" w:color="595959" w:sz="6"/>
-          <w:left w:val="dashed" w:color="595959" w:sz="6"/>
-          <w:bottom w:val="dashed" w:color="595959" w:sz="6"/>
-          <w:right w:val="dashed" w:color="595959" w:sz="6"/>
-        </w:pBdr>
-        <w:spacing w:after="140" w:before="80"/>
+        <w:t xml:space="preserve">Each operation is parallelised with a #pragma omp parallel for. The element-wise operations and the transposes use collapse(2) so the two nested loops are flattened into a single iteration space for the threads to share, and the matrix product parallelises its outer row loop with the inner index and accumulator variables marked private so each thread sums its own dot products. The number of threads actually used is capped: if the user asks for more threads than the largest relevant dimension, the count is reduced to that dimension, so the program never spawns threads that would have no rows to work on. Each operation is timed with omp_get_wtime, and the results — each labelled with its name and its dimensions, followed by the comma-separated values — are written to a single results.txt in which the pairs are clearly separated.</w:t>
+      </w:r>
+    </w:p>
+    <w:p>
+      <w:pPr>
+        <w:spacing w:after="20" w:before="80"/>
+      </w:pPr>
+      <w:r>
+        <w:drawing>
+          <wp:inline distT="0" distB="0" distL="0" distR="0">
+            <wp:extent cx="5715000" cy="3695700"/>
+            <wp:effectExtent t="0" r="0" b="0" l="0"/>
+            <wp:docPr id="8" name="" descr="" title=""/>
+            <wp:cNvGraphicFramePr>
+              <a:graphicFrameLocks xmlns:a="http://schemas.openxmlformats.org/drawingml/2006/main" noChangeAspect="1"/>
+            </wp:cNvGraphicFramePr>
+            <a:graphic xmlns:a="http://schemas.openxmlformats.org/drawingml/2006/main">
+              <a:graphicData uri="http://schemas.openxmlformats.org/drawingml/2006/picture">
+                <pic:pic xmlns:pic="http://schemas.openxmlformats.org/drawingml/2006/picture">
+                  <pic:nvPicPr>
+                    <pic:cNvPr id="0" name="" descr=""/>
+                    <pic:cNvPicPr>
+                      <a:picLocks noChangeAspect="1" noChangeArrowheads="1"/>
+                    </pic:cNvPicPr>
+                  </pic:nvPicPr>
+                  <pic:blipFill>
+                    <a:blip r:embed="rId18" cstate="none"/>
+                    <a:srcRect/>
+                    <a:stretch>
+                      <a:fillRect/>
+                    </a:stretch>
+                  </pic:blipFill>
+                  <pic:spPr bwMode="auto">
+                    <a:xfrm>
+                      <a:off x="0" y="0"/>
+                      <a:ext cx="5715000" cy="3695700"/>
+                    </a:xfrm>
+                    <a:prstGeom prst="rect">
+                      <a:avLst/>
+                    </a:prstGeom>
+                  </pic:spPr>
+                </pic:pic>
+              </a:graphicData>
+            </a:graphic>
+          </wp:inline>
+        </w:drawing>
+      </w:r>
+    </w:p>
+    <w:p>
+      <w:pPr>
+        <w:spacing w:after="160"/>
       </w:pPr>
       <w:r>
         <w:rPr>
           <w:i/>
           <w:iCs/>
-          <w:color w:val="C00000"/>
-        </w:rPr>
-        <w:t xml:space="preserve">[ SCREENSHOT — head of results.txt: one pair's operations, including a line where an operation cannot be done ]</w:t>
+          <w:color w:val="595959"/>
+          <w:sz w:val="18"/>
+          <w:szCs w:val="18"/>
+        </w:rPr>
+        <w:t xml:space="preserve">Figure 2.4 — results.txt, Pair 1: every element-wise operation and both transposes, each labelled with its dimensions.</w:t>
+      </w:r>
+    </w:p>
+    <w:p>
+      <w:pPr>
+        <w:spacing w:after="20" w:before="80"/>
+      </w:pPr>
+      <w:r>
+        <w:drawing>
+          <wp:inline distT="0" distB="0" distL="0" distR="0">
+            <wp:extent cx="5715000" cy="3914775"/>
+            <wp:effectExtent t="0" r="0" b="0" l="0"/>
+            <wp:docPr id="9" name="" descr="" title=""/>
+            <wp:cNvGraphicFramePr>
+              <a:graphicFrameLocks xmlns:a="http://schemas.openxmlformats.org/drawingml/2006/main" noChangeAspect="1"/>
+            </wp:cNvGraphicFramePr>
+            <a:graphic xmlns:a="http://schemas.openxmlformats.org/drawingml/2006/main">
+              <a:graphicData uri="http://schemas.openxmlformats.org/drawingml/2006/picture">
+                <pic:pic xmlns:pic="http://schemas.openxmlformats.org/drawingml/2006/picture">
+                  <pic:nvPicPr>
+                    <pic:cNvPr id="0" name="" descr=""/>
+                    <pic:cNvPicPr>
+                      <a:picLocks noChangeAspect="1" noChangeArrowheads="1"/>
+                    </pic:cNvPicPr>
+                  </pic:nvPicPr>
+                  <pic:blipFill>
+                    <a:blip r:embed="rId19" cstate="none"/>
+                    <a:srcRect/>
+                    <a:stretch>
+                      <a:fillRect/>
+                    </a:stretch>
+                  </pic:blipFill>
+                  <pic:spPr bwMode="auto">
+                    <a:xfrm>
+                      <a:off x="0" y="0"/>
+                      <a:ext cx="5715000" cy="3914775"/>
+                    </a:xfrm>
+                    <a:prstGeom prst="rect">
+                      <a:avLst/>
+                    </a:prstGeom>
+                  </pic:spPr>
+                </pic:pic>
+              </a:graphicData>
+            </a:graphic>
+          </wp:inline>
+        </w:drawing>
+      </w:r>
+    </w:p>
+    <w:p>
+      <w:pPr>
+        <w:spacing w:after="160"/>
+      </w:pPr>
+      <w:r>
+        <w:rPr>
+          <w:i/>
+          <w:iCs/>
+          <w:color w:val="595959"/>
+          <w:sz w:val="18"/>
+          <w:szCs w:val="18"/>
+        </w:rPr>
+        <w:t xml:space="preserve">Figure 2.5 — A pair whose shapes differ: addition, subtraction and the element-wise operations each report that they cannot be done, while the transposes still run.</w:t>
       </w:r>
     </w:p>
     <w:p>
@@ -878,26 +1265,67 @@
         <w:spacing w:after="120"/>
       </w:pPr>
       <w:r>
-        <w:t xml:space="preserve">The program processed all 25 pairs in MatData.txt, with sizes ranging from 3×3 up to 12×12, without error. Individual results were checked against hand calculations; a deliberately incompatible pair produced the expected "cannot be done" messages while its valid operations still ran; and a zero divisor produced NaN as required. To confirm the parallelisation introduced no error, the full dataset was run with 1 thread and again with 8 threads and the two output files compared directly — every operation of every pair was identical, confirming the thread-capping and the parallel loops produce the same answer regardless of the thread count. The malformed-input handling was tested separately with files containing a short row, an over-long row, a non-numeric value and a missing row, each of which was reported with the correct message.</w:t>
-      </w:r>
-    </w:p>
-    <w:p>
-      <w:pPr>
-        <w:pBdr>
-          <w:top w:val="dashed" w:color="595959" w:sz="6"/>
-          <w:left w:val="dashed" w:color="595959" w:sz="6"/>
-          <w:bottom w:val="dashed" w:color="595959" w:sz="6"/>
-          <w:right w:val="dashed" w:color="595959" w:sz="6"/>
-        </w:pBdr>
-        <w:spacing w:after="140" w:before="80"/>
+        <w:t xml:space="preserve">The program processed all 25 pairs in MatData.txt, with sizes ranging from 3×3 up to 12×12, without error. Individual results were checked against hand calculations; a deliberately incompatible pair produced the expected "cannot be done" messages while its valid operations still ran; and a zero divisor produced NaN as required. To confirm the parallelisation introduced no error, the full dataset was run with 1 thread and again with 8 threads and the two output files compared directly — every operation of every pair was identical, confirming the thread-capping and the parallel loops produce the same answer regardless of the thread count.</w:t>
+      </w:r>
+    </w:p>
+    <w:p>
+      <w:pPr>
+        <w:spacing w:after="20" w:before="80"/>
+      </w:pPr>
+      <w:r>
+        <w:drawing>
+          <wp:inline distT="0" distB="0" distL="0" distR="0">
+            <wp:extent cx="5715000" cy="1504950"/>
+            <wp:effectExtent t="0" r="0" b="0" l="0"/>
+            <wp:docPr id="10" name="" descr="" title=""/>
+            <wp:cNvGraphicFramePr>
+              <a:graphicFrameLocks xmlns:a="http://schemas.openxmlformats.org/drawingml/2006/main" noChangeAspect="1"/>
+            </wp:cNvGraphicFramePr>
+            <a:graphic xmlns:a="http://schemas.openxmlformats.org/drawingml/2006/main">
+              <a:graphicData uri="http://schemas.openxmlformats.org/drawingml/2006/picture">
+                <pic:pic xmlns:pic="http://schemas.openxmlformats.org/drawingml/2006/picture">
+                  <pic:nvPicPr>
+                    <pic:cNvPr id="0" name="" descr=""/>
+                    <pic:cNvPicPr>
+                      <a:picLocks noChangeAspect="1" noChangeArrowheads="1"/>
+                    </pic:cNvPicPr>
+                  </pic:nvPicPr>
+                  <pic:blipFill>
+                    <a:blip r:embed="rId20" cstate="none"/>
+                    <a:srcRect/>
+                    <a:stretch>
+                      <a:fillRect/>
+                    </a:stretch>
+                  </pic:blipFill>
+                  <pic:spPr bwMode="auto">
+                    <a:xfrm>
+                      <a:off x="0" y="0"/>
+                      <a:ext cx="5715000" cy="1504950"/>
+                    </a:xfrm>
+                    <a:prstGeom prst="rect">
+                      <a:avLst/>
+                    </a:prstGeom>
+                  </pic:spPr>
+                </pic:pic>
+              </a:graphicData>
+            </a:graphic>
+          </wp:inline>
+        </w:drawing>
+      </w:r>
+    </w:p>
+    <w:p>
+      <w:pPr>
+        <w:spacing w:after="160"/>
       </w:pPr>
       <w:r>
         <w:rPr>
           <w:i/>
           <w:iCs/>
-          <w:color w:val="C00000"/>
-        </w:rPr>
-        <w:t xml:space="preserve">[ SCREENSHOT — the 1-thread vs 8-thread comparison reporting identical results ]</w:t>
+          <w:color w:val="595959"/>
+          <w:sz w:val="18"/>
+          <w:szCs w:val="18"/>
+        </w:rPr>
+        <w:t xml:space="preserve">Figure 2.6 — The 1-thread and 8-thread runs produce identical output.</w:t>
       </w:r>
     </w:p>
     <w:tbl>
@@ -1224,30 +1652,155 @@
     </w:p>
     <w:p>
       <w:pPr>
-        <w:spacing w:after="40"/>
+        <w:spacing w:after="120"/>
       </w:pPr>
       <w:r>
         <w:rPr>
           <w:b/>
           <w:bCs/>
         </w:rPr>
-        <w:t xml:space="preserve">Colab URL:  </w:t>
-      </w:r>
-      <w:r>
-        <w:rPr>
+        <w:t xml:space="preserve">Colab URL (Anyone with the link – Viewer):  </w:t>
+      </w:r>
+      <w:hyperlink w:history="1" r:id="rIdszyfalcbepwr5chlosiu0">
+        <w:r>
+          <w:rPr>
+            <w:rStyle w:val="Hyperlink"/>
+          </w:rPr>
+          <w:t xml:space="preserve">https://colab.research.google.com/drive/1ixjA2INtaXTgrilHp001Uqf55Xrs_Z2x?usp=sharing</w:t>
+        </w:r>
+      </w:hyperlink>
+    </w:p>
+    <w:p>
+      <w:pPr>
+        <w:spacing w:after="120"/>
+      </w:pPr>
+      <w:r>
+        <w:t xml:space="preserve">This task recovers the original passwords behind a file of encrypted strings using the GPU. The encryption function provided has no inverse: each four-character password (two lowercase letters followed by two digits) is put through a fixed sequence of arithmetic steps with wrap-around correction, which cannot be undone algebraically. The space of possible passwords is small and fully enumerable, however — 26 × 26 × 10 × 10 = 67,600 combinations — so brute force is the intended approach: for every encrypted password, try every candidate, encrypt it the same way, and keep the one that matches.</w:t>
+      </w:r>
+    </w:p>
+    <w:p>
+      <w:pPr>
+        <w:pStyle w:val="Heading2"/>
+        <w:spacing w:after="80" w:before="180"/>
+      </w:pPr>
+      <w:r>
+        <w:rPr>
+          <w:b/>
+          <w:bCs/>
+          <w:color w:val="1F4E79"/>
+        </w:rPr>
+        <w:t xml:space="preserve">Converting the encryption to a device function</w:t>
+      </w:r>
+    </w:p>
+    <w:p>
+      <w:pPr>
+        <w:spacing w:after="120"/>
+      </w:pPr>
+      <w:r>
+        <w:t xml:space="preserve">The provided function writes its result into a single static buffer. That is safe on the CPU where it runs one call at a time, but on the GPU, where thousands of threads may run it at once, a shared static buffer would have every thread overwriting the same memory and corrupting each other's results. The function was therefore turned into a __device__ function that writes into a buffer supplied by the caller, so each thread encrypts into its own private memory. The arithmetic itself was carried across unchanged, since only the storage location needed to change, not the encryption logic.</w:t>
+      </w:r>
+    </w:p>
+    <w:p>
+      <w:pPr>
+        <w:spacing w:after="20" w:before="80"/>
+      </w:pPr>
+      <w:r>
+        <w:drawing>
+          <wp:inline distT="0" distB="0" distL="0" distR="0">
+            <wp:extent cx="5715000" cy="3543300"/>
+            <wp:effectExtent t="0" r="0" b="0" l="0"/>
+            <wp:docPr id="11" name="" descr="" title=""/>
+            <wp:cNvGraphicFramePr>
+              <a:graphicFrameLocks xmlns:a="http://schemas.openxmlformats.org/drawingml/2006/main" noChangeAspect="1"/>
+            </wp:cNvGraphicFramePr>
+            <a:graphic xmlns:a="http://schemas.openxmlformats.org/drawingml/2006/main">
+              <a:graphicData uri="http://schemas.openxmlformats.org/drawingml/2006/picture">
+                <pic:pic xmlns:pic="http://schemas.openxmlformats.org/drawingml/2006/picture">
+                  <pic:nvPicPr>
+                    <pic:cNvPr id="0" name="" descr=""/>
+                    <pic:cNvPicPr>
+                      <a:picLocks noChangeAspect="1" noChangeArrowheads="1"/>
+                    </pic:cNvPicPr>
+                  </pic:nvPicPr>
+                  <pic:blipFill>
+                    <a:blip r:embed="rId21" cstate="none"/>
+                    <a:srcRect/>
+                    <a:stretch>
+                      <a:fillRect/>
+                    </a:stretch>
+                  </pic:blipFill>
+                  <pic:spPr bwMode="auto">
+                    <a:xfrm>
+                      <a:off x="0" y="0"/>
+                      <a:ext cx="5715000" cy="3543300"/>
+                    </a:xfrm>
+                    <a:prstGeom prst="rect">
+                      <a:avLst/>
+                    </a:prstGeom>
+                  </pic:spPr>
+                </pic:pic>
+              </a:graphicData>
+            </a:graphic>
+          </wp:inline>
+        </w:drawing>
+      </w:r>
+    </w:p>
+    <w:p>
+      <w:pPr>
+        <w:spacing w:after="160"/>
+      </w:pPr>
+      <w:r>
+        <w:rPr>
+          <w:i/>
+          <w:iCs/>
+          <w:color w:val="595959"/>
+          <w:sz w:val="18"/>
+          <w:szCs w:val="18"/>
+        </w:rPr>
+        <w:t xml:space="preserve">Figure 3.1 — The Colab GPU runtime: nvcc and an NVIDIA Tesla T4.</w:t>
+      </w:r>
+    </w:p>
+    <w:p>
+      <w:pPr>
+        <w:pStyle w:val="Heading2"/>
+        <w:spacing w:after="80" w:before="180"/>
+      </w:pPr>
+      <w:r>
+        <w:rPr>
+          <w:b/>
+          <w:bCs/>
+          <w:color w:val="1F4E79"/>
+        </w:rPr>
+        <w:t xml:space="preserve">Kernel design: one thread per password</w:t>
+      </w:r>
+    </w:p>
+    <w:p>
+      <w:pPr>
+        <w:spacing w:after="120"/>
+      </w:pPr>
+      <w:r>
+        <w:t xml:space="preserve">Each thread is responsible for exactly one encrypted password, not a slice of the search space. A thread reads its target, then loops through all 67,600 candidates, encrypts each with the device function and compares it character by character against the target, writing the matching four-character password and returning as soon as it is found. The launch configuration is computed from the number of passwords in the file: the threads per block is fixed at a standard 256 and the number of blocks is the ceiling of the password count divided by 256, so the work is always spread across multiple blocks in the x dimension (for the 1,000-password test file, four blocks of 256 threads). Assigning one thread per password means no thread ever does more than a single password's worth of work, satisfying the requirement to keep per-thread work minimal and to use multiple blocks and threads rather than one oversized block.</w:t>
+      </w:r>
+    </w:p>
+    <w:p>
+      <w:pPr>
+        <w:pBdr>
+          <w:top w:val="dashed" w:color="C00000" w:sz="6"/>
+          <w:left w:val="dashed" w:color="C00000" w:sz="6"/>
+          <w:bottom w:val="dashed" w:color="C00000" w:sz="6"/>
+          <w:right w:val="dashed" w:color="C00000" w:sz="6"/>
+        </w:pBdr>
+        <w:spacing w:after="160" w:before="80"/>
+      </w:pPr>
+      <w:r>
+        <w:rPr>
+          <w:b/>
+          <w:bCs/>
           <w:i/>
           <w:iCs/>
           <w:color w:val="C00000"/>
         </w:rPr>
-        <w:t xml:space="preserve">[PASTE THE 'ANYONE WITH THE LINK – VIEWER' COLAB LINK FOR Task 3]</w:t>
-      </w:r>
-    </w:p>
-    <w:p>
-      <w:pPr>
-        <w:spacing w:after="120"/>
-      </w:pPr>
-      <w:r>
-        <w:t xml:space="preserve">This task recovers the original passwords behind a file of encrypted strings using the GPU. The encryption function provided has no inverse: each four-character password (two lowercase letters followed by two digits) is put through a fixed sequence of arithmetic steps with wrap-around correction, which cannot be undone algebraically. The space of possible passwords is small and fully enumerable, however — 26 × 26 × 10 × 10 = 67,600 combinations — so brute force is the intended approach: for every encrypted password, try every candidate, encrypt it the same way, and keep the one that matches.</w:t>
+        <w:t xml:space="preserve">[ SCREENSHOT — re-run Task 3 after the launch-config update and paste the run cell here; it should now print "4 blocks x 256 threads" (not 1 block). ]</w:t>
       </w:r>
     </w:p>
     <w:p>
@@ -1261,7 +1814,7 @@
           <w:bCs/>
           <w:color w:val="1F4E79"/>
         </w:rPr>
-        <w:t xml:space="preserve">Converting the encryption to a device function</w:t>
+        <w:t xml:space="preserve">Memory management</w:t>
       </w:r>
     </w:p>
     <w:p>
@@ -1269,7 +1822,67 @@
         <w:spacing w:after="120"/>
       </w:pPr>
       <w:r>
-        <w:t xml:space="preserve">The provided function writes its result into a single static buffer. That is safe on the CPU where it runs one call at a time, but on the GPU, where thousands of threads may run it at once, a shared static buffer would have every thread overwriting the same memory and corrupting each other's results. The function was therefore turned into a __device__ function that writes into a buffer supplied by the caller, so each thread encrypts into its own private memory. The arithmetic itself was carried across unchanged, since only the storage location needed to change, not the encryption logic.</w:t>
+        <w:t xml:space="preserve">The encrypted passwords are read into a single flat host buffer, then copied to the GPU into memory allocated with cudaMalloc sized precisely to the number of passwords found in the file. A second device buffer holds the results, which are copied back to the host once the kernel finishes and written to decrypted.txt. Every CUDA call — each allocation, each transfer, the kernel launch and the synchronisation — is wrapped in an error-checking macro that reports the specific error and its location if anything fails. All device and host memory is freed before the program exits.</w:t>
+      </w:r>
+    </w:p>
+    <w:p>
+      <w:pPr>
+        <w:spacing w:after="20" w:before="80"/>
+      </w:pPr>
+      <w:r>
+        <w:drawing>
+          <wp:inline distT="0" distB="0" distL="0" distR="0">
+            <wp:extent cx="5448300" cy="3590925"/>
+            <wp:effectExtent t="0" r="0" b="0" l="0"/>
+            <wp:docPr id="12" name="" descr="" title=""/>
+            <wp:cNvGraphicFramePr>
+              <a:graphicFrameLocks xmlns:a="http://schemas.openxmlformats.org/drawingml/2006/main" noChangeAspect="1"/>
+            </wp:cNvGraphicFramePr>
+            <a:graphic xmlns:a="http://schemas.openxmlformats.org/drawingml/2006/main">
+              <a:graphicData uri="http://schemas.openxmlformats.org/drawingml/2006/picture">
+                <pic:pic xmlns:pic="http://schemas.openxmlformats.org/drawingml/2006/picture">
+                  <pic:nvPicPr>
+                    <pic:cNvPr id="0" name="" descr=""/>
+                    <pic:cNvPicPr>
+                      <a:picLocks noChangeAspect="1" noChangeArrowheads="1"/>
+                    </pic:cNvPicPr>
+                  </pic:nvPicPr>
+                  <pic:blipFill>
+                    <a:blip r:embed="rId22" cstate="none"/>
+                    <a:srcRect/>
+                    <a:stretch>
+                      <a:fillRect/>
+                    </a:stretch>
+                  </pic:blipFill>
+                  <pic:spPr bwMode="auto">
+                    <a:xfrm>
+                      <a:off x="0" y="0"/>
+                      <a:ext cx="5448300" cy="3590925"/>
+                    </a:xfrm>
+                    <a:prstGeom prst="rect">
+                      <a:avLst/>
+                    </a:prstGeom>
+                  </pic:spPr>
+                </pic:pic>
+              </a:graphicData>
+            </a:graphic>
+          </wp:inline>
+        </w:drawing>
+      </w:r>
+    </w:p>
+    <w:p>
+      <w:pPr>
+        <w:spacing w:after="160"/>
+      </w:pPr>
+      <w:r>
+        <w:rPr>
+          <w:i/>
+          <w:iCs/>
+          <w:color w:val="595959"/>
+          <w:sz w:val="18"/>
+          <w:szCs w:val="18"/>
+        </w:rPr>
+        <w:t xml:space="preserve">Figure 3.2 — The head of decrypted.txt: each encrypted string mapped to its recovered four-character password.</w:t>
       </w:r>
     </w:p>
     <w:p>
@@ -1283,7 +1896,7 @@
           <w:bCs/>
           <w:color w:val="1F4E79"/>
         </w:rPr>
-        <w:t xml:space="preserve">Kernel design: one thread per password</w:t>
+        <w:t xml:space="preserve">Testing and validation</w:t>
       </w:r>
     </w:p>
     <w:p>
@@ -1291,127 +1904,67 @@
         <w:spacing w:after="120"/>
       </w:pPr>
       <w:r>
-        <w:t xml:space="preserve">Each thread is responsible for exactly one encrypted password, not a slice of the search space. A thread reads its target, then loops through all 67,600 candidates, encrypts each with the device function and compares it character by character against the target, writing the matching four-character password and returning as soon as it is found. The launch configuration is computed from the number of passwords in the file rather than hard-coded: the threads-per-block is set and the number of blocks calculated to cover the count, so that for a file of 10,000 passwords the grid is 10 blocks of 1,000 threads — exactly one of the layouts the brief gives as appropriate. Assigning one thread per password means no thread ever does more than a single password's worth of work, satisfying the requirement to keep per-thread work minimal regardless of file size.</w:t>
-      </w:r>
-    </w:p>
-    <w:p>
-      <w:pPr>
-        <w:pBdr>
-          <w:top w:val="dashed" w:color="595959" w:sz="6"/>
-          <w:left w:val="dashed" w:color="595959" w:sz="6"/>
-          <w:bottom w:val="dashed" w:color="595959" w:sz="6"/>
-          <w:right w:val="dashed" w:color="595959" w:sz="6"/>
-        </w:pBdr>
-        <w:spacing w:after="140" w:before="80"/>
+        <w:t xml:space="preserve">Because the encrypted file alone does not reveal the originals, a small generator (passgen.c) was written using the exact encryption function to produce a test file of 1,000 passwords together with a second file of the known plaintext, purely for checking. Running the cracker against the encrypted file and comparing its output line by line against the known originals confirmed an exact match on every password, with no mismatches. This shows both that the device version of the encryption is a faithful copy of the original and that the brute-force search finds the correct password for each entry.</w:t>
+      </w:r>
+    </w:p>
+    <w:p>
+      <w:pPr>
+        <w:spacing w:after="20" w:before="80"/>
+      </w:pPr>
+      <w:r>
+        <w:drawing>
+          <wp:inline distT="0" distB="0" distL="0" distR="0">
+            <wp:extent cx="5715000" cy="1362075"/>
+            <wp:effectExtent t="0" r="0" b="0" l="0"/>
+            <wp:docPr id="13" name="" descr="" title=""/>
+            <wp:cNvGraphicFramePr>
+              <a:graphicFrameLocks xmlns:a="http://schemas.openxmlformats.org/drawingml/2006/main" noChangeAspect="1"/>
+            </wp:cNvGraphicFramePr>
+            <a:graphic xmlns:a="http://schemas.openxmlformats.org/drawingml/2006/main">
+              <a:graphicData uri="http://schemas.openxmlformats.org/drawingml/2006/picture">
+                <pic:pic xmlns:pic="http://schemas.openxmlformats.org/drawingml/2006/picture">
+                  <pic:nvPicPr>
+                    <pic:cNvPr id="0" name="" descr=""/>
+                    <pic:cNvPicPr>
+                      <a:picLocks noChangeAspect="1" noChangeArrowheads="1"/>
+                    </pic:cNvPicPr>
+                  </pic:nvPicPr>
+                  <pic:blipFill>
+                    <a:blip r:embed="rId23" cstate="none"/>
+                    <a:srcRect/>
+                    <a:stretch>
+                      <a:fillRect/>
+                    </a:stretch>
+                  </pic:blipFill>
+                  <pic:spPr bwMode="auto">
+                    <a:xfrm>
+                      <a:off x="0" y="0"/>
+                      <a:ext cx="5715000" cy="1362075"/>
+                    </a:xfrm>
+                    <a:prstGeom prst="rect">
+                      <a:avLst/>
+                    </a:prstGeom>
+                  </pic:spPr>
+                </pic:pic>
+              </a:graphicData>
+            </a:graphic>
+          </wp:inline>
+        </w:drawing>
+      </w:r>
+    </w:p>
+    <w:p>
+      <w:pPr>
+        <w:spacing w:after="160"/>
       </w:pPr>
       <w:r>
         <w:rPr>
           <w:i/>
           <w:iCs/>
-          <w:color w:val="C00000"/>
-        </w:rPr>
-        <w:t xml:space="preserve">[ SCREENSHOT — Colab cell: nvcc --version and nvidia-smi showing the GPU ]</w:t>
-      </w:r>
-    </w:p>
-    <w:p>
-      <w:pPr>
-        <w:pBdr>
-          <w:top w:val="dashed" w:color="595959" w:sz="6"/>
-          <w:left w:val="dashed" w:color="595959" w:sz="6"/>
-          <w:bottom w:val="dashed" w:color="595959" w:sz="6"/>
-          <w:right w:val="dashed" w:color="595959" w:sz="6"/>
-        </w:pBdr>
-        <w:spacing w:after="140" w:before="80"/>
-      </w:pPr>
-      <w:r>
-        <w:rPr>
-          <w:i/>
-          <w:iCs/>
-          <w:color w:val="C00000"/>
-        </w:rPr>
-        <w:t xml:space="preserve">[ SCREENSHOT — Colab cell: ./crack running, printing the blocks × threads configuration ]</w:t>
-      </w:r>
-    </w:p>
-    <w:p>
-      <w:pPr>
-        <w:pStyle w:val="Heading2"/>
-        <w:spacing w:after="80" w:before="180"/>
-      </w:pPr>
-      <w:r>
-        <w:rPr>
-          <w:b/>
-          <w:bCs/>
-          <w:color w:val="1F4E79"/>
-        </w:rPr>
-        <w:t xml:space="preserve">Memory management</w:t>
-      </w:r>
-    </w:p>
-    <w:p>
-      <w:pPr>
-        <w:spacing w:after="120"/>
-      </w:pPr>
-      <w:r>
-        <w:t xml:space="preserve">The encrypted passwords are read into a single flat host buffer, then copied to the GPU into memory allocated with cudaMalloc sized precisely to the number of passwords found in the file. A second device buffer holds the results, which are copied back to the host once the kernel finishes and written to decrypted.txt. Every CUDA call — each allocation, each transfer, the kernel launch and the synchronisation — is wrapped in an error-checking macro that reports the specific error and its location if anything fails, so a problem cannot pass unnoticed. All device and host memory is freed before the program exits.</w:t>
-      </w:r>
-    </w:p>
-    <w:p>
-      <w:pPr>
-        <w:pBdr>
-          <w:top w:val="dashed" w:color="595959" w:sz="6"/>
-          <w:left w:val="dashed" w:color="595959" w:sz="6"/>
-          <w:bottom w:val="dashed" w:color="595959" w:sz="6"/>
-          <w:right w:val="dashed" w:color="595959" w:sz="6"/>
-        </w:pBdr>
-        <w:spacing w:after="140" w:before="80"/>
-      </w:pPr>
-      <w:r>
-        <w:rPr>
-          <w:i/>
-          <w:iCs/>
-          <w:color w:val="C00000"/>
-        </w:rPr>
-        <w:t xml:space="preserve">[ SCREENSHOT — head of decrypted.txt showing recovered passwords in the correct format ]</w:t>
-      </w:r>
-    </w:p>
-    <w:p>
-      <w:pPr>
-        <w:pStyle w:val="Heading2"/>
-        <w:spacing w:after="80" w:before="180"/>
-      </w:pPr>
-      <w:r>
-        <w:rPr>
-          <w:b/>
-          <w:bCs/>
-          <w:color w:val="1F4E79"/>
-        </w:rPr>
-        <w:t xml:space="preserve">Testing and validation</w:t>
-      </w:r>
-    </w:p>
-    <w:p>
-      <w:pPr>
-        <w:spacing w:after="120"/>
-      </w:pPr>
-      <w:r>
-        <w:t xml:space="preserve">Because the encrypted file alone does not reveal the originals, a small generator (passgen.c) was written using the exact encryption function to produce a test file of 1,000 passwords together with a second file of the known plaintext, purely for checking. Running the cracker against the encrypted file and comparing its output line by line against the known originals confirmed an exact match on every password, with no mismatches. This shows both that the device version of the encryption is a faithful copy of the original and that the brute-force search finds the correct password for each entry.</w:t>
-      </w:r>
-    </w:p>
-    <w:p>
-      <w:pPr>
-        <w:pBdr>
-          <w:top w:val="dashed" w:color="595959" w:sz="6"/>
-          <w:left w:val="dashed" w:color="595959" w:sz="6"/>
-          <w:bottom w:val="dashed" w:color="595959" w:sz="6"/>
-          <w:right w:val="dashed" w:color="595959" w:sz="6"/>
-        </w:pBdr>
-        <w:spacing w:after="140" w:before="80"/>
-      </w:pPr>
-      <w:r>
-        <w:rPr>
-          <w:i/>
-          <w:iCs/>
-          <w:color w:val="C00000"/>
-        </w:rPr>
-        <w:t xml:space="preserve">[ SCREENSHOT — the check comparing decrypted.txt against the known originals, reporting a full match ]</w:t>
+          <w:color w:val="595959"/>
+          <w:sz w:val="18"/>
+          <w:szCs w:val="18"/>
+        </w:rPr>
+        <w:t xml:space="preserve">Figure 3.3 — Every recovered password matches the known originals ("ALL MATCH").</w:t>
       </w:r>
     </w:p>
     <w:tbl>
@@ -1617,7 +2170,7 @@
                 <w:bCs w:val="false"/>
                 <w:color w:val="000000"/>
               </w:rPr>
-              <w:t xml:space="preserve">One thread per password, 67,600-candidate brute force</w:t>
+              <w:t xml:space="preserve">One thread per password over multiple blocks, 67,600-candidate brute force</w:t>
             </w:r>
           </w:p>
         </w:tc>
@@ -1785,23 +2338,23 @@
     </w:p>
     <w:p>
       <w:pPr>
-        <w:spacing w:after="40"/>
+        <w:spacing w:after="120"/>
       </w:pPr>
       <w:r>
         <w:rPr>
           <w:b/>
           <w:bCs/>
         </w:rPr>
-        <w:t xml:space="preserve">Colab URL:  </w:t>
-      </w:r>
-      <w:r>
-        <w:rPr>
-          <w:i/>
-          <w:iCs/>
-          <w:color w:val="C00000"/>
-        </w:rPr>
-        <w:t xml:space="preserve">[PASTE THE 'ANYONE WITH THE LINK – VIEWER' COLAB LINK FOR Task 4]</w:t>
-      </w:r>
+        <w:t xml:space="preserve">Colab URL (Anyone with the link – Viewer):  </w:t>
+      </w:r>
+      <w:hyperlink w:history="1" r:id="rIdo7j82hnzoz5091tdjg2qv">
+        <w:r>
+          <w:rPr>
+            <w:rStyle w:val="Hyperlink"/>
+          </w:rPr>
+          <w:t xml:space="preserve">https://colab.research.google.com/drive/184m_Gee0D0neMj2Jak5xdMMbVgQsXNP7?usp=sharing</w:t>
+        </w:r>
+      </w:hyperlink>
     </w:p>
     <w:p>
       <w:pPr>
@@ -1835,40 +2388,122 @@
     </w:p>
     <w:p>
       <w:pPr>
-        <w:pBdr>
-          <w:top w:val="dashed" w:color="595959" w:sz="6"/>
-          <w:left w:val="dashed" w:color="595959" w:sz="6"/>
-          <w:bottom w:val="dashed" w:color="595959" w:sz="6"/>
-          <w:right w:val="dashed" w:color="595959" w:sz="6"/>
-        </w:pBdr>
-        <w:spacing w:after="140" w:before="80"/>
+        <w:spacing w:after="20" w:before="80"/>
+      </w:pPr>
+      <w:r>
+        <w:drawing>
+          <wp:inline distT="0" distB="0" distL="0" distR="0">
+            <wp:extent cx="5715000" cy="1219200"/>
+            <wp:effectExtent t="0" r="0" b="0" l="0"/>
+            <wp:docPr id="14" name="" descr="" title=""/>
+            <wp:cNvGraphicFramePr>
+              <a:graphicFrameLocks xmlns:a="http://schemas.openxmlformats.org/drawingml/2006/main" noChangeAspect="1"/>
+            </wp:cNvGraphicFramePr>
+            <a:graphic xmlns:a="http://schemas.openxmlformats.org/drawingml/2006/main">
+              <a:graphicData uri="http://schemas.openxmlformats.org/drawingml/2006/picture">
+                <pic:pic xmlns:pic="http://schemas.openxmlformats.org/drawingml/2006/picture">
+                  <pic:nvPicPr>
+                    <pic:cNvPr id="0" name="" descr=""/>
+                    <pic:cNvPicPr>
+                      <a:picLocks noChangeAspect="1" noChangeArrowheads="1"/>
+                    </pic:cNvPicPr>
+                  </pic:nvPicPr>
+                  <pic:blipFill>
+                    <a:blip r:embed="rId24" cstate="none"/>
+                    <a:srcRect/>
+                    <a:stretch>
+                      <a:fillRect/>
+                    </a:stretch>
+                  </pic:blipFill>
+                  <pic:spPr bwMode="auto">
+                    <a:xfrm>
+                      <a:off x="0" y="0"/>
+                      <a:ext cx="5715000" cy="1219200"/>
+                    </a:xfrm>
+                    <a:prstGeom prst="rect">
+                      <a:avLst/>
+                    </a:prstGeom>
+                  </pic:spPr>
+                </pic:pic>
+              </a:graphicData>
+            </a:graphic>
+          </wp:inline>
+        </w:drawing>
+      </w:r>
+    </w:p>
+    <w:p>
+      <w:pPr>
+        <w:spacing w:after="160"/>
       </w:pPr>
       <w:r>
         <w:rPr>
           <w:i/>
           <w:iCs/>
-          <w:color w:val="C00000"/>
-        </w:rPr>
-        <w:t xml:space="preserve">[ SCREENSHOT — Colab cell: nvcc compiling sobel.cu together with lodepng.cpp ]</w:t>
-      </w:r>
-    </w:p>
-    <w:p>
-      <w:pPr>
-        <w:pBdr>
-          <w:top w:val="dashed" w:color="595959" w:sz="6"/>
-          <w:left w:val="dashed" w:color="595959" w:sz="6"/>
-          <w:bottom w:val="dashed" w:color="595959" w:sz="6"/>
-          <w:right w:val="dashed" w:color="595959" w:sz="6"/>
-        </w:pBdr>
-        <w:spacing w:after="140" w:before="80"/>
+          <w:color w:val="595959"/>
+          <w:sz w:val="18"/>
+          <w:szCs w:val="18"/>
+        </w:rPr>
+        <w:t xml:space="preserve">Figure 4.1 — Compiling sobel.cu together with lodepng.cpp using nvcc.</w:t>
+      </w:r>
+    </w:p>
+    <w:p>
+      <w:pPr>
+        <w:spacing w:after="20" w:before="80"/>
+      </w:pPr>
+      <w:r>
+        <w:drawing>
+          <wp:inline distT="0" distB="0" distL="0" distR="0">
+            <wp:extent cx="5715000" cy="2781300"/>
+            <wp:effectExtent t="0" r="0" b="0" l="0"/>
+            <wp:docPr id="15" name="" descr="" title=""/>
+            <wp:cNvGraphicFramePr>
+              <a:graphicFrameLocks xmlns:a="http://schemas.openxmlformats.org/drawingml/2006/main" noChangeAspect="1"/>
+            </wp:cNvGraphicFramePr>
+            <a:graphic xmlns:a="http://schemas.openxmlformats.org/drawingml/2006/main">
+              <a:graphicData uri="http://schemas.openxmlformats.org/drawingml/2006/picture">
+                <pic:pic xmlns:pic="http://schemas.openxmlformats.org/drawingml/2006/picture">
+                  <pic:nvPicPr>
+                    <pic:cNvPr id="0" name="" descr=""/>
+                    <pic:cNvPicPr>
+                      <a:picLocks noChangeAspect="1" noChangeArrowheads="1"/>
+                    </pic:cNvPicPr>
+                  </pic:nvPicPr>
+                  <pic:blipFill>
+                    <a:blip r:embed="rId25" cstate="none"/>
+                    <a:srcRect/>
+                    <a:stretch>
+                      <a:fillRect/>
+                    </a:stretch>
+                  </pic:blipFill>
+                  <pic:spPr bwMode="auto">
+                    <a:xfrm>
+                      <a:off x="0" y="0"/>
+                      <a:ext cx="5715000" cy="2781300"/>
+                    </a:xfrm>
+                    <a:prstGeom prst="rect">
+                      <a:avLst/>
+                    </a:prstGeom>
+                  </pic:spPr>
+                </pic:pic>
+              </a:graphicData>
+            </a:graphic>
+          </wp:inline>
+        </w:drawing>
+      </w:r>
+    </w:p>
+    <w:p>
+      <w:pPr>
+        <w:spacing w:after="160"/>
       </w:pPr>
       <w:r>
         <w:rPr>
           <w:i/>
           <w:iCs/>
-          <w:color w:val="C00000"/>
-        </w:rPr>
-        <w:t xml:space="preserve">[ SCREENSHOT — Colab cell: ./sobel running over several images, printing each image's dimensions ]</w:t>
+          <w:color w:val="595959"/>
+          <w:sz w:val="18"/>
+          <w:szCs w:val="18"/>
+        </w:rPr>
+        <w:t xml:space="preserve">Figure 4.2 — Processing all six test images in one run, including the 1,200-pixel-wide image; GPU and host memory are freed per image and the batch finishes with 6 processed and 0 skipped.</w:t>
       </w:r>
     </w:p>
     <w:p>
@@ -1890,53 +2525,127 @@
         <w:spacing w:after="120"/>
       </w:pPr>
       <w:r>
-        <w:t xml:space="preserve">Each thread computes one output pixel, identified from its block and thread indices in both x and y, since an image is naturally two-dimensional. The 3×3 neighbourhood around the pixel is read in a single pass, accumulating Gx and Gy together, and the edge strength is their combined magnitude, the square root of Gx² + Gy², clamped to the maximum value of 255. The image borders are handled with zero padding, exactly as the brief describes: when a neighbour would fall outside the image, its value is simply treated as zero instead of being read from memory, so the same code handles edge pixels and interior pixels alike with no special case. A fixed 16×16 block size is used and the grid dimensions are calculated from each image's actual width and height, so a single program handles images of any size, including the partial blocks along the right and bottom edges when the dimensions are not multiples of sixteen.</w:t>
-      </w:r>
-    </w:p>
-    <w:p>
-      <w:pPr>
-        <w:spacing w:after="120"/>
-      </w:pPr>
-      <w:r>
-        <w:t xml:space="preserve">This two-dimensional grid is also why the program scales beyond the simple one-block-per-row launch shown in some examples: the test set deliberately includes an image 1,200 pixels wide, which exceeds the 1,024-thread limit of a single block and so could not be processed by a launch that maps one thread to each pixel in a row, but is handled correctly here.</w:t>
-      </w:r>
-    </w:p>
-    <w:p>
-      <w:pPr>
-        <w:pBdr>
-          <w:top w:val="dashed" w:color="595959" w:sz="6"/>
-          <w:left w:val="dashed" w:color="595959" w:sz="6"/>
-          <w:bottom w:val="dashed" w:color="595959" w:sz="6"/>
-          <w:right w:val="dashed" w:color="595959" w:sz="6"/>
-        </w:pBdr>
-        <w:spacing w:after="140" w:before="80"/>
+        <w:t xml:space="preserve">Each thread computes one output pixel, identified from its block and thread indices in both x and y, since an image is naturally two-dimensional. The 3×3 neighbourhood around the pixel is read in a single pass, accumulating Gx and Gy together, and the edge strength is their combined magnitude, the square root of Gx² + Gy², clamped to the maximum value of 255. The image borders are handled with zero padding, exactly as the brief describes: when a neighbour would fall outside the image, its value is simply treated as zero instead of being read from memory, so the same code handles edge pixels and interior pixels alike with no special case. A fixed 16×16 block size is used and the grid dimensions are calculated from each image's actual width and height, so a single program handles images of any size — including the 1,200-pixel-wide test image above, which exceeds the 1,024-thread limit of a single block and so could not be processed by a launch that maps one thread to each pixel in a single row.</w:t>
+      </w:r>
+    </w:p>
+    <w:p>
+      <w:pPr>
+        <w:spacing w:after="20" w:before="80"/>
+      </w:pPr>
+      <w:r>
+        <w:drawing>
+          <wp:inline distT="0" distB="0" distL="0" distR="0">
+            <wp:extent cx="5715000" cy="2200275"/>
+            <wp:effectExtent t="0" r="0" b="0" l="0"/>
+            <wp:docPr id="16" name="" descr="" title=""/>
+            <wp:cNvGraphicFramePr>
+              <a:graphicFrameLocks xmlns:a="http://schemas.openxmlformats.org/drawingml/2006/main" noChangeAspect="1"/>
+            </wp:cNvGraphicFramePr>
+            <a:graphic xmlns:a="http://schemas.openxmlformats.org/drawingml/2006/main">
+              <a:graphicData uri="http://schemas.openxmlformats.org/drawingml/2006/picture">
+                <pic:pic xmlns:pic="http://schemas.openxmlformats.org/drawingml/2006/picture">
+                  <pic:nvPicPr>
+                    <pic:cNvPr id="0" name="" descr=""/>
+                    <pic:cNvPicPr>
+                      <a:picLocks noChangeAspect="1" noChangeArrowheads="1"/>
+                    </pic:cNvPicPr>
+                  </pic:nvPicPr>
+                  <pic:blipFill>
+                    <a:blip r:embed="rId26" cstate="none"/>
+                    <a:srcRect/>
+                    <a:stretch>
+                      <a:fillRect/>
+                    </a:stretch>
+                  </pic:blipFill>
+                  <pic:spPr bwMode="auto">
+                    <a:xfrm>
+                      <a:off x="0" y="0"/>
+                      <a:ext cx="5715000" cy="2200275"/>
+                    </a:xfrm>
+                    <a:prstGeom prst="rect">
+                      <a:avLst/>
+                    </a:prstGeom>
+                  </pic:spPr>
+                </pic:pic>
+              </a:graphicData>
+            </a:graphic>
+          </wp:inline>
+        </w:drawing>
+      </w:r>
+    </w:p>
+    <w:p>
+      <w:pPr>
+        <w:spacing w:after="160"/>
       </w:pPr>
       <w:r>
         <w:rPr>
           <w:i/>
           <w:iCs/>
-          <w:color w:val="C00000"/>
-        </w:rPr>
-        <w:t xml:space="preserve">[ SCREENSHOT — side-by-side of the input photograph and its edge map (sample_photo.png) ]</w:t>
-      </w:r>
-    </w:p>
-    <w:p>
-      <w:pPr>
-        <w:pBdr>
-          <w:top w:val="dashed" w:color="595959" w:sz="6"/>
-          <w:left w:val="dashed" w:color="595959" w:sz="6"/>
-          <w:bottom w:val="dashed" w:color="595959" w:sz="6"/>
-          <w:right w:val="dashed" w:color="595959" w:sz="6"/>
-        </w:pBdr>
-        <w:spacing w:after="140" w:before="80"/>
+          <w:color w:val="595959"/>
+          <w:sz w:val="18"/>
+          <w:szCs w:val="18"/>
+        </w:rPr>
+        <w:t xml:space="preserve">Figure 4.3 — The input photograph beside its edge map: the outlines, tusks and skin texture are traced, while the flat sky is suppressed to black.</w:t>
+      </w:r>
+    </w:p>
+    <w:p>
+      <w:pPr>
+        <w:spacing w:after="20" w:before="80"/>
+      </w:pPr>
+      <w:r>
+        <w:drawing>
+          <wp:inline distT="0" distB="0" distL="0" distR="0">
+            <wp:extent cx="4810125" cy="4076700"/>
+            <wp:effectExtent t="0" r="0" b="0" l="0"/>
+            <wp:docPr id="17" name="" descr="" title=""/>
+            <wp:cNvGraphicFramePr>
+              <a:graphicFrameLocks xmlns:a="http://schemas.openxmlformats.org/drawingml/2006/main" noChangeAspect="1"/>
+            </wp:cNvGraphicFramePr>
+            <a:graphic xmlns:a="http://schemas.openxmlformats.org/drawingml/2006/main">
+              <a:graphicData uri="http://schemas.openxmlformats.org/drawingml/2006/picture">
+                <pic:pic xmlns:pic="http://schemas.openxmlformats.org/drawingml/2006/picture">
+                  <pic:nvPicPr>
+                    <pic:cNvPr id="0" name="" descr=""/>
+                    <pic:cNvPicPr>
+                      <a:picLocks noChangeAspect="1" noChangeArrowheads="1"/>
+                    </pic:cNvPicPr>
+                  </pic:nvPicPr>
+                  <pic:blipFill>
+                    <a:blip r:embed="rId27" cstate="none"/>
+                    <a:srcRect/>
+                    <a:stretch>
+                      <a:fillRect/>
+                    </a:stretch>
+                  </pic:blipFill>
+                  <pic:spPr bwMode="auto">
+                    <a:xfrm>
+                      <a:off x="0" y="0"/>
+                      <a:ext cx="4810125" cy="4076700"/>
+                    </a:xfrm>
+                    <a:prstGeom prst="rect">
+                      <a:avLst/>
+                    </a:prstGeom>
+                  </pic:spPr>
+                </pic:pic>
+              </a:graphicData>
+            </a:graphic>
+          </wp:inline>
+        </w:drawing>
+      </w:r>
+    </w:p>
+    <w:p>
+      <w:pPr>
+        <w:spacing w:after="160"/>
       </w:pPr>
       <w:r>
         <w:rPr>
           <w:i/>
           <w:iCs/>
-          <w:color w:val="C00000"/>
-        </w:rPr>
-        <w:t xml:space="preserve">[ SCREENSHOT — the 1,200-pixel-wide image processed correctly ]</w:t>
+          <w:color w:val="595959"/>
+          <w:sz w:val="18"/>
+          <w:szCs w:val="18"/>
+        </w:rPr>
+        <w:t xml:space="preserve">Figure 4.4 — The resulting edge map in full (a true greyscale image, bright = strong edge).</w:t>
       </w:r>
     </w:p>
     <w:p>
@@ -1958,48 +2667,7 @@
         <w:spacing w:after="120"/>
       </w:pPr>
       <w:r>
-        <w:t xml:space="preserve">For each image, GPU memory for the input and output buffers is allocated with cudaMalloc sized exactly to that image (four bytes per pixel for the RGBA channels), rather than reusing one fixed buffer across the batch. Every CUDA call is checked through an error-handling macro that cleans up and skips the image on failure instead of producing a corrupt result. Once an image's edge map has been copied back and written to file, its GPU and host buffers are freed before the next image begins, so memory use stays flat however many images are processed.</w:t>
-      </w:r>
-    </w:p>
-    <w:p>
-      <w:pPr>
-        <w:pBdr>
-          <w:top w:val="dashed" w:color="595959" w:sz="6"/>
-          <w:left w:val="dashed" w:color="595959" w:sz="6"/>
-          <w:bottom w:val="dashed" w:color="595959" w:sz="6"/>
-          <w:right w:val="dashed" w:color="595959" w:sz="6"/>
-        </w:pBdr>
-        <w:spacing w:after="140" w:before="80"/>
-      </w:pPr>
-      <w:r>
-        <w:rPr>
-          <w:i/>
-          <w:iCs/>
-          <w:color w:val="C00000"/>
-        </w:rPr>
-        <w:t xml:space="preserve">[ SCREENSHOT — the per-image cudaFree / free cleanup, and the final batch summary ]</w:t>
-      </w:r>
-    </w:p>
-    <w:p>
-      <w:pPr>
-        <w:pStyle w:val="Heading2"/>
-        <w:spacing w:after="80" w:before="180"/>
-      </w:pPr>
-      <w:r>
-        <w:rPr>
-          <w:b/>
-          <w:bCs/>
-          <w:color w:val="1F4E79"/>
-        </w:rPr>
-        <w:t xml:space="preserve">Testing and validation</w:t>
-      </w:r>
-    </w:p>
-    <w:p>
-      <w:pPr>
-        <w:spacing w:after="120"/>
-      </w:pPr>
-      <w:r>
-        <w:t xml:space="preserve">The kernel's arithmetic was first checked against a reference implementation of the same calculation (greyscale, the two gradients, the clamped magnitude and zero padding), which reproduced the expected values on the small test images and agreed with a hand calculation on the 4×4 case. The same program was then run on the GPU against a real photograph, producing a clearly correct edge map: the outlines and fine texture of the subject are traced while flat areas such as the sky are correctly suppressed to black. Running the whole batch — the photograph, several small fixed-size images and the 1,200-pixel-wide image — confirmed that every image was processed and written out, and that memory was freed between images.</w:t>
+        <w:t xml:space="preserve">For each image, GPU memory for the input and output buffers is allocated with cudaMalloc sized exactly to that image (four bytes per pixel for the RGBA channels), rather than reusing one fixed buffer across the batch. Every CUDA call is checked through an error-handling macro that cleans up and skips the image on failure instead of producing a corrupt result. Once an image's edge map has been copied back and written to file, its GPU and host buffers are freed before the next image begins, so memory use stays flat however many images are processed — confirmed by the batch above completing all six images with none skipped.</w:t>
       </w:r>
     </w:p>
     <w:tbl>

</xml_diff>

<commit_message>
Add the updated Task 3 run screenshot (4 blocks x 256 threads) to the report
</commit_message>
<xml_diff>
--- a/Evidence/Report/6CS005_Report.docx
+++ b/Evidence/Report/6CS005_Report.docx
@@ -271,7 +271,7 @@
         </w:rPr>
         <w:t xml:space="preserve">Colab URL (Anyone with the link – Viewer):  </w:t>
       </w:r>
-      <w:hyperlink w:history="1" r:id="rId7x7dj7ivzmdgajiv44sib">
+      <w:hyperlink w:history="1" r:id="rIdv7hktembvlx-k5223cyot">
         <w:r>
           <w:rPr>
             <w:rStyle w:val="Hyperlink"/>
@@ -863,7 +863,7 @@
         </w:rPr>
         <w:t xml:space="preserve">Colab URL (Anyone with the link – Viewer):  </w:t>
       </w:r>
-      <w:hyperlink w:history="1" r:id="rId2cdqkq5tna1fx7p1swpc5">
+      <w:hyperlink w:history="1" r:id="rIdf2n-vlhiaqldiamq76pfp">
         <w:r>
           <w:rPr>
             <w:rStyle w:val="Hyperlink"/>
@@ -1661,7 +1661,7 @@
         </w:rPr>
         <w:t xml:space="preserve">Colab URL (Anyone with the link – Viewer):  </w:t>
       </w:r>
-      <w:hyperlink w:history="1" r:id="rIdszyfalcbepwr5chlosiu0">
+      <w:hyperlink w:history="1" r:id="rIdzj0kqcjepxcigcnkd4olc">
         <w:r>
           <w:rPr>
             <w:rStyle w:val="Hyperlink"/>
@@ -1784,55 +1784,12 @@
     </w:p>
     <w:p>
       <w:pPr>
-        <w:pBdr>
-          <w:top w:val="dashed" w:color="C00000" w:sz="6"/>
-          <w:left w:val="dashed" w:color="C00000" w:sz="6"/>
-          <w:bottom w:val="dashed" w:color="C00000" w:sz="6"/>
-          <w:right w:val="dashed" w:color="C00000" w:sz="6"/>
-        </w:pBdr>
-        <w:spacing w:after="160" w:before="80"/>
-      </w:pPr>
-      <w:r>
-        <w:rPr>
-          <w:b/>
-          <w:bCs/>
-          <w:i/>
-          <w:iCs/>
-          <w:color w:val="C00000"/>
-        </w:rPr>
-        <w:t xml:space="preserve">[ SCREENSHOT — re-run Task 3 after the launch-config update and paste the run cell here; it should now print "4 blocks x 256 threads" (not 1 block). ]</w:t>
-      </w:r>
-    </w:p>
-    <w:p>
-      <w:pPr>
-        <w:pStyle w:val="Heading2"/>
-        <w:spacing w:after="80" w:before="180"/>
-      </w:pPr>
-      <w:r>
-        <w:rPr>
-          <w:b/>
-          <w:bCs/>
-          <w:color w:val="1F4E79"/>
-        </w:rPr>
-        <w:t xml:space="preserve">Memory management</w:t>
-      </w:r>
-    </w:p>
-    <w:p>
-      <w:pPr>
-        <w:spacing w:after="120"/>
-      </w:pPr>
-      <w:r>
-        <w:t xml:space="preserve">The encrypted passwords are read into a single flat host buffer, then copied to the GPU into memory allocated with cudaMalloc sized precisely to the number of passwords found in the file. A second device buffer holds the results, which are copied back to the host once the kernel finishes and written to decrypted.txt. Every CUDA call — each allocation, each transfer, the kernel launch and the synchronisation — is wrapped in an error-checking macro that reports the specific error and its location if anything fails. All device and host memory is freed before the program exits.</w:t>
-      </w:r>
-    </w:p>
-    <w:p>
-      <w:pPr>
         <w:spacing w:after="20" w:before="80"/>
       </w:pPr>
       <w:r>
         <w:drawing>
           <wp:inline distT="0" distB="0" distL="0" distR="0">
-            <wp:extent cx="5448300" cy="3590925"/>
+            <wp:extent cx="5715000" cy="1809750"/>
             <wp:effectExtent t="0" r="0" b="0" l="0"/>
             <wp:docPr id="12" name="" descr="" title=""/>
             <wp:cNvGraphicFramePr>
@@ -1857,7 +1814,7 @@
                   <pic:spPr bwMode="auto">
                     <a:xfrm>
                       <a:off x="0" y="0"/>
-                      <a:ext cx="5448300" cy="3590925"/>
+                      <a:ext cx="5715000" cy="1809750"/>
                     </a:xfrm>
                     <a:prstGeom prst="rect">
                       <a:avLst/>
@@ -1882,7 +1839,7 @@
           <w:sz w:val="18"/>
           <w:szCs w:val="18"/>
         </w:rPr>
-        <w:t xml:space="preserve">Figure 3.2 — The head of decrypted.txt: each encrypted string mapped to its recovered four-character password.</w:t>
+        <w:t xml:space="preserve">Figure 3.2 — Cracking the 1,000-password file: the grid is split into 4 blocks of 256 threads (multiple blocks in x), one thread per password.</w:t>
       </w:r>
     </w:p>
     <w:p>
@@ -1896,7 +1853,7 @@
           <w:bCs/>
           <w:color w:val="1F4E79"/>
         </w:rPr>
-        <w:t xml:space="preserve">Testing and validation</w:t>
+        <w:t xml:space="preserve">Memory management</w:t>
       </w:r>
     </w:p>
     <w:p>
@@ -1904,7 +1861,7 @@
         <w:spacing w:after="120"/>
       </w:pPr>
       <w:r>
-        <w:t xml:space="preserve">Because the encrypted file alone does not reveal the originals, a small generator (passgen.c) was written using the exact encryption function to produce a test file of 1,000 passwords together with a second file of the known plaintext, purely for checking. Running the cracker against the encrypted file and comparing its output line by line against the known originals confirmed an exact match on every password, with no mismatches. This shows both that the device version of the encryption is a faithful copy of the original and that the brute-force search finds the correct password for each entry.</w:t>
+        <w:t xml:space="preserve">The encrypted passwords are read into a single flat host buffer, then copied to the GPU into memory allocated with cudaMalloc sized precisely to the number of passwords found in the file. A second device buffer holds the results, which are copied back to the host once the kernel finishes and written to decrypted.txt. Every CUDA call — each allocation, each transfer, the kernel launch and the synchronisation — is wrapped in an error-checking macro that reports the specific error and its location if anything fails. All device and host memory is freed before the program exits.</w:t>
       </w:r>
     </w:p>
     <w:p>
@@ -1914,7 +1871,7 @@
       <w:r>
         <w:drawing>
           <wp:inline distT="0" distB="0" distL="0" distR="0">
-            <wp:extent cx="5715000" cy="1362075"/>
+            <wp:extent cx="5448300" cy="3590925"/>
             <wp:effectExtent t="0" r="0" b="0" l="0"/>
             <wp:docPr id="13" name="" descr="" title=""/>
             <wp:cNvGraphicFramePr>
@@ -1939,7 +1896,7 @@
                   <pic:spPr bwMode="auto">
                     <a:xfrm>
                       <a:off x="0" y="0"/>
-                      <a:ext cx="5715000" cy="1362075"/>
+                      <a:ext cx="5448300" cy="3590925"/>
                     </a:xfrm>
                     <a:prstGeom prst="rect">
                       <a:avLst/>
@@ -1964,368 +1921,13 @@
           <w:sz w:val="18"/>
           <w:szCs w:val="18"/>
         </w:rPr>
-        <w:t xml:space="preserve">Figure 3.3 — Every recovered password matches the known originals ("ALL MATCH").</w:t>
-      </w:r>
-    </w:p>
-    <w:tbl>
-      <w:tblPr>
-        <w:tblW w:type="dxa" w:w="9000"/>
-        <w:tblBorders>
-          <w:top w:val="single" w:color="auto" w:sz="4"/>
-          <w:left w:val="single" w:color="auto" w:sz="4"/>
-          <w:bottom w:val="single" w:color="auto" w:sz="4"/>
-          <w:right w:val="single" w:color="auto" w:sz="4"/>
-          <w:insideH w:val="single" w:color="auto" w:sz="4"/>
-          <w:insideV w:val="single" w:color="auto" w:sz="4"/>
-        </w:tblBorders>
-      </w:tblPr>
-      <w:tblGrid>
-        <w:gridCol w:w="4700"/>
-        <w:gridCol w:w="1300"/>
-        <w:gridCol w:w="3000"/>
-      </w:tblGrid>
-      <w:tr>
-        <w:tc>
-          <w:tcPr>
-            <w:tcW w:type="dxa" w:w="4700"/>
-            <w:shd w:fill="1F4E79" w:val="clear"/>
-          </w:tcPr>
-          <w:p>
-            <w:r>
-              <w:rPr>
-                <w:b/>
-                <w:bCs/>
-                <w:color w:val="FFFFFF"/>
-              </w:rPr>
-              <w:t xml:space="preserve">Marking criterion</w:t>
-            </w:r>
-          </w:p>
-        </w:tc>
-        <w:tc>
-          <w:tcPr>
-            <w:tcW w:type="dxa" w:w="1300"/>
-            <w:shd w:fill="1F4E79" w:val="clear"/>
-          </w:tcPr>
-          <w:p>
-            <w:r>
-              <w:rPr>
-                <w:b/>
-                <w:bCs/>
-                <w:color w:val="FFFFFF"/>
-              </w:rPr>
-              <w:t xml:space="preserve">Marks</w:t>
-            </w:r>
-          </w:p>
-        </w:tc>
-        <w:tc>
-          <w:tcPr>
-            <w:tcW w:type="dxa" w:w="3000"/>
-            <w:shd w:fill="1F4E79" w:val="clear"/>
-          </w:tcPr>
-          <w:p>
-            <w:r>
-              <w:rPr>
-                <w:b/>
-                <w:bCs/>
-                <w:color w:val="FFFFFF"/>
-              </w:rPr>
-              <w:t xml:space="preserve">Where it is met</w:t>
-            </w:r>
-          </w:p>
-        </w:tc>
-      </w:tr>
-      <w:tr>
-        <w:tc>
-          <w:tcPr>
-            <w:tcW w:type="dxa" w:w="4700"/>
-          </w:tcPr>
-          <w:p>
-            <w:r>
-              <w:rPr>
-                <w:b w:val="false"/>
-                <w:bCs w:val="false"/>
-                <w:color w:val="000000"/>
-              </w:rPr>
-              <w:t xml:space="preserve">Read file into CPU memory</w:t>
-            </w:r>
-          </w:p>
-        </w:tc>
-        <w:tc>
-          <w:tcPr>
-            <w:tcW w:type="dxa" w:w="1300"/>
-          </w:tcPr>
-          <w:p>
-            <w:r>
-              <w:rPr>
-                <w:b w:val="false"/>
-                <w:bCs w:val="false"/>
-                <w:color w:val="000000"/>
-              </w:rPr>
-              <w:t xml:space="preserve">5</w:t>
-            </w:r>
-          </w:p>
-        </w:tc>
-        <w:tc>
-          <w:tcPr>
-            <w:tcW w:type="dxa" w:w="3000"/>
-          </w:tcPr>
-          <w:p>
-            <w:r>
-              <w:rPr>
-                <w:b w:val="false"/>
-                <w:bCs w:val="false"/>
-                <w:color w:val="000000"/>
-              </w:rPr>
-              <w:t xml:space="preserve">Two-pass read into a flat host buffer</w:t>
-            </w:r>
-          </w:p>
-        </w:tc>
-      </w:tr>
-      <w:tr>
-        <w:tc>
-          <w:tcPr>
-            <w:tcW w:type="dxa" w:w="4700"/>
-          </w:tcPr>
-          <w:p>
-            <w:r>
-              <w:rPr>
-                <w:b w:val="false"/>
-                <w:bCs w:val="false"/>
-                <w:color w:val="000000"/>
-              </w:rPr>
-              <w:t xml:space="preserve">Allocate GPU memory to file size and transfer</w:t>
-            </w:r>
-          </w:p>
-        </w:tc>
-        <w:tc>
-          <w:tcPr>
-            <w:tcW w:type="dxa" w:w="1300"/>
-          </w:tcPr>
-          <w:p>
-            <w:r>
-              <w:rPr>
-                <w:b w:val="false"/>
-                <w:bCs w:val="false"/>
-                <w:color w:val="000000"/>
-              </w:rPr>
-              <w:t xml:space="preserve">20</w:t>
-            </w:r>
-          </w:p>
-        </w:tc>
-        <w:tc>
-          <w:tcPr>
-            <w:tcW w:type="dxa" w:w="3000"/>
-          </w:tcPr>
-          <w:p>
-            <w:r>
-              <w:rPr>
-                <w:b w:val="false"/>
-                <w:bCs w:val="false"/>
-                <w:color w:val="000000"/>
-              </w:rPr>
-              <w:t xml:space="preserve">cudaMalloc sized to the password count, cudaMemcpy to device</w:t>
-            </w:r>
-          </w:p>
-        </w:tc>
-      </w:tr>
-      <w:tr>
-        <w:tc>
-          <w:tcPr>
-            <w:tcW w:type="dxa" w:w="4700"/>
-          </w:tcPr>
-          <w:p>
-            <w:r>
-              <w:rPr>
-                <w:b w:val="false"/>
-                <w:bCs w:val="false"/>
-                <w:color w:val="000000"/>
-              </w:rPr>
-              <w:t xml:space="preserve">Passwords decrypted via the kernel</w:t>
-            </w:r>
-          </w:p>
-        </w:tc>
-        <w:tc>
-          <w:tcPr>
-            <w:tcW w:type="dxa" w:w="1300"/>
-          </w:tcPr>
-          <w:p>
-            <w:r>
-              <w:rPr>
-                <w:b w:val="false"/>
-                <w:bCs w:val="false"/>
-                <w:color w:val="000000"/>
-              </w:rPr>
-              <w:t xml:space="preserve">35</w:t>
-            </w:r>
-          </w:p>
-        </w:tc>
-        <w:tc>
-          <w:tcPr>
-            <w:tcW w:type="dxa" w:w="3000"/>
-          </w:tcPr>
-          <w:p>
-            <w:r>
-              <w:rPr>
-                <w:b w:val="false"/>
-                <w:bCs w:val="false"/>
-                <w:color w:val="000000"/>
-              </w:rPr>
-              <w:t xml:space="preserve">One thread per password over multiple blocks, 67,600-candidate brute force</w:t>
-            </w:r>
-          </w:p>
-        </w:tc>
-      </w:tr>
-      <w:tr>
-        <w:tc>
-          <w:tcPr>
-            <w:tcW w:type="dxa" w:w="4700"/>
-          </w:tcPr>
-          <w:p>
-            <w:r>
-              <w:rPr>
-                <w:b w:val="false"/>
-                <w:bCs w:val="false"/>
-                <w:color w:val="000000"/>
-              </w:rPr>
-              <w:t xml:space="preserve">Results transferred safely back to host</w:t>
-            </w:r>
-          </w:p>
-        </w:tc>
-        <w:tc>
-          <w:tcPr>
-            <w:tcW w:type="dxa" w:w="1300"/>
-          </w:tcPr>
-          <w:p>
-            <w:r>
-              <w:rPr>
-                <w:b w:val="false"/>
-                <w:bCs w:val="false"/>
-                <w:color w:val="000000"/>
-              </w:rPr>
-              <w:t xml:space="preserve">20</w:t>
-            </w:r>
-          </w:p>
-        </w:tc>
-        <w:tc>
-          <w:tcPr>
-            <w:tcW w:type="dxa" w:w="3000"/>
-          </w:tcPr>
-          <w:p>
-            <w:r>
-              <w:rPr>
-                <w:b w:val="false"/>
-                <w:bCs w:val="false"/>
-                <w:color w:val="000000"/>
-              </w:rPr>
-              <w:t xml:space="preserve">cudaMemcpy device-to-host after synchronise</w:t>
-            </w:r>
-          </w:p>
-        </w:tc>
-      </w:tr>
-      <w:tr>
-        <w:tc>
-          <w:tcPr>
-            <w:tcW w:type="dxa" w:w="4700"/>
-          </w:tcPr>
-          <w:p>
-            <w:r>
-              <w:rPr>
-                <w:b w:val="false"/>
-                <w:bCs w:val="false"/>
-                <w:color w:val="000000"/>
-              </w:rPr>
-              <w:t xml:space="preserve">Write decrypted passwords to a file</w:t>
-            </w:r>
-          </w:p>
-        </w:tc>
-        <w:tc>
-          <w:tcPr>
-            <w:tcW w:type="dxa" w:w="1300"/>
-          </w:tcPr>
-          <w:p>
-            <w:r>
-              <w:rPr>
-                <w:b w:val="false"/>
-                <w:bCs w:val="false"/>
-                <w:color w:val="000000"/>
-              </w:rPr>
-              <w:t xml:space="preserve">15</w:t>
-            </w:r>
-          </w:p>
-        </w:tc>
-        <w:tc>
-          <w:tcPr>
-            <w:tcW w:type="dxa" w:w="3000"/>
-          </w:tcPr>
-          <w:p>
-            <w:r>
-              <w:rPr>
-                <w:b w:val="false"/>
-                <w:bCs w:val="false"/>
-                <w:color w:val="000000"/>
-              </w:rPr>
-              <w:t xml:space="preserve">decrypted.txt</w:t>
-            </w:r>
-          </w:p>
-        </w:tc>
-      </w:tr>
-      <w:tr>
-        <w:tc>
-          <w:tcPr>
-            <w:tcW w:type="dxa" w:w="4700"/>
-          </w:tcPr>
-          <w:p>
-            <w:r>
-              <w:rPr>
-                <w:b w:val="false"/>
-                <w:bCs w:val="false"/>
-                <w:color w:val="000000"/>
-              </w:rPr>
-              <w:t xml:space="preserve">Free memory appropriately</w:t>
-            </w:r>
-          </w:p>
-        </w:tc>
-        <w:tc>
-          <w:tcPr>
-            <w:tcW w:type="dxa" w:w="1300"/>
-          </w:tcPr>
-          <w:p>
-            <w:r>
-              <w:rPr>
-                <w:b w:val="false"/>
-                <w:bCs w:val="false"/>
-                <w:color w:val="000000"/>
-              </w:rPr>
-              <w:t xml:space="preserve">5</w:t>
-            </w:r>
-          </w:p>
-        </w:tc>
-        <w:tc>
-          <w:tcPr>
-            <w:tcW w:type="dxa" w:w="3000"/>
-          </w:tcPr>
-          <w:p>
-            <w:r>
-              <w:rPr>
-                <w:b w:val="false"/>
-                <w:bCs w:val="false"/>
-                <w:color w:val="000000"/>
-              </w:rPr>
-              <w:t xml:space="preserve">All device and host buffers freed</w:t>
-            </w:r>
-          </w:p>
-        </w:tc>
-      </w:tr>
-    </w:tbl>
-    <w:p>
-      <w:r>
-        <w:br w:type="page"/>
-      </w:r>
-    </w:p>
-    <w:p>
-      <w:pPr>
-        <w:pStyle w:val="Heading1"/>
-        <w:spacing w:after="120" w:before="240"/>
+        <w:t xml:space="preserve">Figure 3.3 — The head of decrypted.txt: each encrypted string mapped to its recovered four-character password.</w:t>
+      </w:r>
+    </w:p>
+    <w:p>
+      <w:pPr>
+        <w:pStyle w:val="Heading2"/>
+        <w:spacing w:after="80" w:before="180"/>
       </w:pPr>
       <w:r>
         <w:rPr>
@@ -2333,7 +1935,7 @@
           <w:bCs/>
           <w:color w:val="1F4E79"/>
         </w:rPr>
-        <w:t xml:space="preserve">Task 4 — Sobel Edge Detection across many PNGs (CUDA)</w:t>
+        <w:t xml:space="preserve">Testing and validation</w:t>
       </w:r>
     </w:p>
     <w:p>
@@ -2341,49 +1943,7 @@
         <w:spacing w:after="120"/>
       </w:pPr>
       <w:r>
-        <w:rPr>
-          <w:b/>
-          <w:bCs/>
-        </w:rPr>
-        <w:t xml:space="preserve">Colab URL (Anyone with the link – Viewer):  </w:t>
-      </w:r>
-      <w:hyperlink w:history="1" r:id="rIdo7j82hnzoz5091tdjg2qv">
-        <w:r>
-          <w:rPr>
-            <w:rStyle w:val="Hyperlink"/>
-          </w:rPr>
-          <w:t xml:space="preserve">https://colab.research.google.com/drive/184m_Gee0D0neMj2Jak5xdMMbVgQsXNP7?usp=sharing</w:t>
-        </w:r>
-      </w:hyperlink>
-    </w:p>
-    <w:p>
-      <w:pPr>
-        <w:spacing w:after="120"/>
-      </w:pPr>
-      <w:r>
-        <w:t xml:space="preserve">This task applies the Sobel edge-detection algorithm to one or more PNG images on the GPU. For every pixel it computes a horizontal gradient with the Gx kernel and a vertical gradient with the Gy kernel, combines them into a single edge-strength value, and writes a new image — an edge map — in which bright pixels mark strong edges and dark pixels mark flat regions.</w:t>
-      </w:r>
-    </w:p>
-    <w:p>
-      <w:pPr>
-        <w:pStyle w:val="Heading2"/>
-        <w:spacing w:after="80" w:before="180"/>
-      </w:pPr>
-      <w:r>
-        <w:rPr>
-          <w:b/>
-          <w:bCs/>
-          <w:color w:val="1F4E79"/>
-        </w:rPr>
-        <w:t xml:space="preserve">Image input and output</w:t>
-      </w:r>
-    </w:p>
-    <w:p>
-      <w:pPr>
-        <w:spacing w:after="120"/>
-      </w:pPr>
-      <w:r>
-        <w:t xml:space="preserve">Images are decoded and encoded with lodepng, the library used in the module's workshop, loading each file as 32-bit RGBA. Rather than converting to greyscale on the CPU first, the conversion is done once per pixel inside the kernel from the raw red, green and blue values using the standard luminance weighting 0.299R + 0.587G + 0.114B. Because the brief asks for edge detection across many images, the program accepts any number of image paths on the command line and processes each one independently — its own decode, its own GPU memory, its own kernel launch, its own output file and its own cleanup — so one image has no effect on another, and a file that fails to decode is reported and skipped while the rest of the batch continues. Each output is named from its input, so photo.png becomes photo_sobel.png.</w:t>
+        <w:t xml:space="preserve">Because the encrypted file alone does not reveal the originals, a small generator (passgen.c) was written using the exact encryption function to produce a test file of 1,000 passwords together with a second file of the known plaintext, purely for checking. Running the cracker against the encrypted file and comparing its output line by line against the known originals confirmed an exact match on every password, with no mismatches. This shows both that the device version of the encryption is a faithful copy of the original and that the brute-force search finds the correct password for each entry.</w:t>
       </w:r>
     </w:p>
     <w:p>
@@ -2393,7 +1953,7 @@
       <w:r>
         <w:drawing>
           <wp:inline distT="0" distB="0" distL="0" distR="0">
-            <wp:extent cx="5715000" cy="1219200"/>
+            <wp:extent cx="5715000" cy="1362075"/>
             <wp:effectExtent t="0" r="0" b="0" l="0"/>
             <wp:docPr id="14" name="" descr="" title=""/>
             <wp:cNvGraphicFramePr>
@@ -2418,7 +1978,7 @@
                   <pic:spPr bwMode="auto">
                     <a:xfrm>
                       <a:off x="0" y="0"/>
-                      <a:ext cx="5715000" cy="1219200"/>
+                      <a:ext cx="5715000" cy="1362075"/>
                     </a:xfrm>
                     <a:prstGeom prst="rect">
                       <a:avLst/>
@@ -2443,7 +2003,426 @@
           <w:sz w:val="18"/>
           <w:szCs w:val="18"/>
         </w:rPr>
-        <w:t xml:space="preserve">Figure 4.1 — Compiling sobel.cu together with lodepng.cpp using nvcc.</w:t>
+        <w:t xml:space="preserve">Figure 3.4 — Every recovered password matches the known originals ("ALL MATCH").</w:t>
+      </w:r>
+    </w:p>
+    <w:tbl>
+      <w:tblPr>
+        <w:tblW w:type="dxa" w:w="9000"/>
+        <w:tblBorders>
+          <w:top w:val="single" w:color="auto" w:sz="4"/>
+          <w:left w:val="single" w:color="auto" w:sz="4"/>
+          <w:bottom w:val="single" w:color="auto" w:sz="4"/>
+          <w:right w:val="single" w:color="auto" w:sz="4"/>
+          <w:insideH w:val="single" w:color="auto" w:sz="4"/>
+          <w:insideV w:val="single" w:color="auto" w:sz="4"/>
+        </w:tblBorders>
+      </w:tblPr>
+      <w:tblGrid>
+        <w:gridCol w:w="4700"/>
+        <w:gridCol w:w="1300"/>
+        <w:gridCol w:w="3000"/>
+      </w:tblGrid>
+      <w:tr>
+        <w:tc>
+          <w:tcPr>
+            <w:tcW w:type="dxa" w:w="4700"/>
+            <w:shd w:fill="1F4E79" w:val="clear"/>
+          </w:tcPr>
+          <w:p>
+            <w:r>
+              <w:rPr>
+                <w:b/>
+                <w:bCs/>
+                <w:color w:val="FFFFFF"/>
+              </w:rPr>
+              <w:t xml:space="preserve">Marking criterion</w:t>
+            </w:r>
+          </w:p>
+        </w:tc>
+        <w:tc>
+          <w:tcPr>
+            <w:tcW w:type="dxa" w:w="1300"/>
+            <w:shd w:fill="1F4E79" w:val="clear"/>
+          </w:tcPr>
+          <w:p>
+            <w:r>
+              <w:rPr>
+                <w:b/>
+                <w:bCs/>
+                <w:color w:val="FFFFFF"/>
+              </w:rPr>
+              <w:t xml:space="preserve">Marks</w:t>
+            </w:r>
+          </w:p>
+        </w:tc>
+        <w:tc>
+          <w:tcPr>
+            <w:tcW w:type="dxa" w:w="3000"/>
+            <w:shd w:fill="1F4E79" w:val="clear"/>
+          </w:tcPr>
+          <w:p>
+            <w:r>
+              <w:rPr>
+                <w:b/>
+                <w:bCs/>
+                <w:color w:val="FFFFFF"/>
+              </w:rPr>
+              <w:t xml:space="preserve">Where it is met</w:t>
+            </w:r>
+          </w:p>
+        </w:tc>
+      </w:tr>
+      <w:tr>
+        <w:tc>
+          <w:tcPr>
+            <w:tcW w:type="dxa" w:w="4700"/>
+          </w:tcPr>
+          <w:p>
+            <w:r>
+              <w:rPr>
+                <w:b w:val="false"/>
+                <w:bCs w:val="false"/>
+                <w:color w:val="000000"/>
+              </w:rPr>
+              <w:t xml:space="preserve">Read file into CPU memory</w:t>
+            </w:r>
+          </w:p>
+        </w:tc>
+        <w:tc>
+          <w:tcPr>
+            <w:tcW w:type="dxa" w:w="1300"/>
+          </w:tcPr>
+          <w:p>
+            <w:r>
+              <w:rPr>
+                <w:b w:val="false"/>
+                <w:bCs w:val="false"/>
+                <w:color w:val="000000"/>
+              </w:rPr>
+              <w:t xml:space="preserve">5</w:t>
+            </w:r>
+          </w:p>
+        </w:tc>
+        <w:tc>
+          <w:tcPr>
+            <w:tcW w:type="dxa" w:w="3000"/>
+          </w:tcPr>
+          <w:p>
+            <w:r>
+              <w:rPr>
+                <w:b w:val="false"/>
+                <w:bCs w:val="false"/>
+                <w:color w:val="000000"/>
+              </w:rPr>
+              <w:t xml:space="preserve">Two-pass read into a flat host buffer</w:t>
+            </w:r>
+          </w:p>
+        </w:tc>
+      </w:tr>
+      <w:tr>
+        <w:tc>
+          <w:tcPr>
+            <w:tcW w:type="dxa" w:w="4700"/>
+          </w:tcPr>
+          <w:p>
+            <w:r>
+              <w:rPr>
+                <w:b w:val="false"/>
+                <w:bCs w:val="false"/>
+                <w:color w:val="000000"/>
+              </w:rPr>
+              <w:t xml:space="preserve">Allocate GPU memory to file size and transfer</w:t>
+            </w:r>
+          </w:p>
+        </w:tc>
+        <w:tc>
+          <w:tcPr>
+            <w:tcW w:type="dxa" w:w="1300"/>
+          </w:tcPr>
+          <w:p>
+            <w:r>
+              <w:rPr>
+                <w:b w:val="false"/>
+                <w:bCs w:val="false"/>
+                <w:color w:val="000000"/>
+              </w:rPr>
+              <w:t xml:space="preserve">20</w:t>
+            </w:r>
+          </w:p>
+        </w:tc>
+        <w:tc>
+          <w:tcPr>
+            <w:tcW w:type="dxa" w:w="3000"/>
+          </w:tcPr>
+          <w:p>
+            <w:r>
+              <w:rPr>
+                <w:b w:val="false"/>
+                <w:bCs w:val="false"/>
+                <w:color w:val="000000"/>
+              </w:rPr>
+              <w:t xml:space="preserve">cudaMalloc sized to the password count, cudaMemcpy to device</w:t>
+            </w:r>
+          </w:p>
+        </w:tc>
+      </w:tr>
+      <w:tr>
+        <w:tc>
+          <w:tcPr>
+            <w:tcW w:type="dxa" w:w="4700"/>
+          </w:tcPr>
+          <w:p>
+            <w:r>
+              <w:rPr>
+                <w:b w:val="false"/>
+                <w:bCs w:val="false"/>
+                <w:color w:val="000000"/>
+              </w:rPr>
+              <w:t xml:space="preserve">Passwords decrypted via the kernel</w:t>
+            </w:r>
+          </w:p>
+        </w:tc>
+        <w:tc>
+          <w:tcPr>
+            <w:tcW w:type="dxa" w:w="1300"/>
+          </w:tcPr>
+          <w:p>
+            <w:r>
+              <w:rPr>
+                <w:b w:val="false"/>
+                <w:bCs w:val="false"/>
+                <w:color w:val="000000"/>
+              </w:rPr>
+              <w:t xml:space="preserve">35</w:t>
+            </w:r>
+          </w:p>
+        </w:tc>
+        <w:tc>
+          <w:tcPr>
+            <w:tcW w:type="dxa" w:w="3000"/>
+          </w:tcPr>
+          <w:p>
+            <w:r>
+              <w:rPr>
+                <w:b w:val="false"/>
+                <w:bCs w:val="false"/>
+                <w:color w:val="000000"/>
+              </w:rPr>
+              <w:t xml:space="preserve">One thread per password over multiple blocks, 67,600-candidate brute force</w:t>
+            </w:r>
+          </w:p>
+        </w:tc>
+      </w:tr>
+      <w:tr>
+        <w:tc>
+          <w:tcPr>
+            <w:tcW w:type="dxa" w:w="4700"/>
+          </w:tcPr>
+          <w:p>
+            <w:r>
+              <w:rPr>
+                <w:b w:val="false"/>
+                <w:bCs w:val="false"/>
+                <w:color w:val="000000"/>
+              </w:rPr>
+              <w:t xml:space="preserve">Results transferred safely back to host</w:t>
+            </w:r>
+          </w:p>
+        </w:tc>
+        <w:tc>
+          <w:tcPr>
+            <w:tcW w:type="dxa" w:w="1300"/>
+          </w:tcPr>
+          <w:p>
+            <w:r>
+              <w:rPr>
+                <w:b w:val="false"/>
+                <w:bCs w:val="false"/>
+                <w:color w:val="000000"/>
+              </w:rPr>
+              <w:t xml:space="preserve">20</w:t>
+            </w:r>
+          </w:p>
+        </w:tc>
+        <w:tc>
+          <w:tcPr>
+            <w:tcW w:type="dxa" w:w="3000"/>
+          </w:tcPr>
+          <w:p>
+            <w:r>
+              <w:rPr>
+                <w:b w:val="false"/>
+                <w:bCs w:val="false"/>
+                <w:color w:val="000000"/>
+              </w:rPr>
+              <w:t xml:space="preserve">cudaMemcpy device-to-host after synchronise</w:t>
+            </w:r>
+          </w:p>
+        </w:tc>
+      </w:tr>
+      <w:tr>
+        <w:tc>
+          <w:tcPr>
+            <w:tcW w:type="dxa" w:w="4700"/>
+          </w:tcPr>
+          <w:p>
+            <w:r>
+              <w:rPr>
+                <w:b w:val="false"/>
+                <w:bCs w:val="false"/>
+                <w:color w:val="000000"/>
+              </w:rPr>
+              <w:t xml:space="preserve">Write decrypted passwords to a file</w:t>
+            </w:r>
+          </w:p>
+        </w:tc>
+        <w:tc>
+          <w:tcPr>
+            <w:tcW w:type="dxa" w:w="1300"/>
+          </w:tcPr>
+          <w:p>
+            <w:r>
+              <w:rPr>
+                <w:b w:val="false"/>
+                <w:bCs w:val="false"/>
+                <w:color w:val="000000"/>
+              </w:rPr>
+              <w:t xml:space="preserve">15</w:t>
+            </w:r>
+          </w:p>
+        </w:tc>
+        <w:tc>
+          <w:tcPr>
+            <w:tcW w:type="dxa" w:w="3000"/>
+          </w:tcPr>
+          <w:p>
+            <w:r>
+              <w:rPr>
+                <w:b w:val="false"/>
+                <w:bCs w:val="false"/>
+                <w:color w:val="000000"/>
+              </w:rPr>
+              <w:t xml:space="preserve">decrypted.txt</w:t>
+            </w:r>
+          </w:p>
+        </w:tc>
+      </w:tr>
+      <w:tr>
+        <w:tc>
+          <w:tcPr>
+            <w:tcW w:type="dxa" w:w="4700"/>
+          </w:tcPr>
+          <w:p>
+            <w:r>
+              <w:rPr>
+                <w:b w:val="false"/>
+                <w:bCs w:val="false"/>
+                <w:color w:val="000000"/>
+              </w:rPr>
+              <w:t xml:space="preserve">Free memory appropriately</w:t>
+            </w:r>
+          </w:p>
+        </w:tc>
+        <w:tc>
+          <w:tcPr>
+            <w:tcW w:type="dxa" w:w="1300"/>
+          </w:tcPr>
+          <w:p>
+            <w:r>
+              <w:rPr>
+                <w:b w:val="false"/>
+                <w:bCs w:val="false"/>
+                <w:color w:val="000000"/>
+              </w:rPr>
+              <w:t xml:space="preserve">5</w:t>
+            </w:r>
+          </w:p>
+        </w:tc>
+        <w:tc>
+          <w:tcPr>
+            <w:tcW w:type="dxa" w:w="3000"/>
+          </w:tcPr>
+          <w:p>
+            <w:r>
+              <w:rPr>
+                <w:b w:val="false"/>
+                <w:bCs w:val="false"/>
+                <w:color w:val="000000"/>
+              </w:rPr>
+              <w:t xml:space="preserve">All device and host buffers freed</w:t>
+            </w:r>
+          </w:p>
+        </w:tc>
+      </w:tr>
+    </w:tbl>
+    <w:p>
+      <w:r>
+        <w:br w:type="page"/>
+      </w:r>
+    </w:p>
+    <w:p>
+      <w:pPr>
+        <w:pStyle w:val="Heading1"/>
+        <w:spacing w:after="120" w:before="240"/>
+      </w:pPr>
+      <w:r>
+        <w:rPr>
+          <w:b/>
+          <w:bCs/>
+          <w:color w:val="1F4E79"/>
+        </w:rPr>
+        <w:t xml:space="preserve">Task 4 — Sobel Edge Detection across many PNGs (CUDA)</w:t>
+      </w:r>
+    </w:p>
+    <w:p>
+      <w:pPr>
+        <w:spacing w:after="120"/>
+      </w:pPr>
+      <w:r>
+        <w:rPr>
+          <w:b/>
+          <w:bCs/>
+        </w:rPr>
+        <w:t xml:space="preserve">Colab URL (Anyone with the link – Viewer):  </w:t>
+      </w:r>
+      <w:hyperlink w:history="1" r:id="rIdv9zfnicr3zq7yt5y203c9">
+        <w:r>
+          <w:rPr>
+            <w:rStyle w:val="Hyperlink"/>
+          </w:rPr>
+          <w:t xml:space="preserve">https://colab.research.google.com/drive/184m_Gee0D0neMj2Jak5xdMMbVgQsXNP7?usp=sharing</w:t>
+        </w:r>
+      </w:hyperlink>
+    </w:p>
+    <w:p>
+      <w:pPr>
+        <w:spacing w:after="120"/>
+      </w:pPr>
+      <w:r>
+        <w:t xml:space="preserve">This task applies the Sobel edge-detection algorithm to one or more PNG images on the GPU. For every pixel it computes a horizontal gradient with the Gx kernel and a vertical gradient with the Gy kernel, combines them into a single edge-strength value, and writes a new image — an edge map — in which bright pixels mark strong edges and dark pixels mark flat regions.</w:t>
+      </w:r>
+    </w:p>
+    <w:p>
+      <w:pPr>
+        <w:pStyle w:val="Heading2"/>
+        <w:spacing w:after="80" w:before="180"/>
+      </w:pPr>
+      <w:r>
+        <w:rPr>
+          <w:b/>
+          <w:bCs/>
+          <w:color w:val="1F4E79"/>
+        </w:rPr>
+        <w:t xml:space="preserve">Image input and output</w:t>
+      </w:r>
+    </w:p>
+    <w:p>
+      <w:pPr>
+        <w:spacing w:after="120"/>
+      </w:pPr>
+      <w:r>
+        <w:t xml:space="preserve">Images are decoded and encoded with lodepng, the library used in the module's workshop, loading each file as 32-bit RGBA. Rather than converting to greyscale on the CPU first, the conversion is done once per pixel inside the kernel from the raw red, green and blue values using the standard luminance weighting 0.299R + 0.587G + 0.114B. Because the brief asks for edge detection across many images, the program accepts any number of image paths on the command line and processes each one independently — its own decode, its own GPU memory, its own kernel launch, its own output file and its own cleanup — so one image has no effect on another, and a file that fails to decode is reported and skipped while the rest of the batch continues. Each output is named from its input, so photo.png becomes photo_sobel.png.</w:t>
       </w:r>
     </w:p>
     <w:p>
@@ -2453,7 +2432,7 @@
       <w:r>
         <w:drawing>
           <wp:inline distT="0" distB="0" distL="0" distR="0">
-            <wp:extent cx="5715000" cy="2781300"/>
+            <wp:extent cx="5715000" cy="1219200"/>
             <wp:effectExtent t="0" r="0" b="0" l="0"/>
             <wp:docPr id="15" name="" descr="" title=""/>
             <wp:cNvGraphicFramePr>
@@ -2478,7 +2457,7 @@
                   <pic:spPr bwMode="auto">
                     <a:xfrm>
                       <a:off x="0" y="0"/>
-                      <a:ext cx="5715000" cy="2781300"/>
+                      <a:ext cx="5715000" cy="1219200"/>
                     </a:xfrm>
                     <a:prstGeom prst="rect">
                       <a:avLst/>
@@ -2503,29 +2482,7 @@
           <w:sz w:val="18"/>
           <w:szCs w:val="18"/>
         </w:rPr>
-        <w:t xml:space="preserve">Figure 4.2 — Processing all six test images in one run, including the 1,200-pixel-wide image; GPU and host memory are freed per image and the batch finishes with 6 processed and 0 skipped.</w:t>
-      </w:r>
-    </w:p>
-    <w:p>
-      <w:pPr>
-        <w:pStyle w:val="Heading2"/>
-        <w:spacing w:after="80" w:before="180"/>
-      </w:pPr>
-      <w:r>
-        <w:rPr>
-          <w:b/>
-          <w:bCs/>
-          <w:color w:val="1F4E79"/>
-        </w:rPr>
-        <w:t xml:space="preserve">The kernel, borders and the grid</w:t>
-      </w:r>
-    </w:p>
-    <w:p>
-      <w:pPr>
-        <w:spacing w:after="120"/>
-      </w:pPr>
-      <w:r>
-        <w:t xml:space="preserve">Each thread computes one output pixel, identified from its block and thread indices in both x and y, since an image is naturally two-dimensional. The 3×3 neighbourhood around the pixel is read in a single pass, accumulating Gx and Gy together, and the edge strength is their combined magnitude, the square root of Gx² + Gy², clamped to the maximum value of 255. The image borders are handled with zero padding, exactly as the brief describes: when a neighbour would fall outside the image, its value is simply treated as zero instead of being read from memory, so the same code handles edge pixels and interior pixels alike with no special case. A fixed 16×16 block size is used and the grid dimensions are calculated from each image's actual width and height, so a single program handles images of any size — including the 1,200-pixel-wide test image above, which exceeds the 1,024-thread limit of a single block and so could not be processed by a launch that maps one thread to each pixel in a single row.</w:t>
+        <w:t xml:space="preserve">Figure 4.1 — Compiling sobel.cu together with lodepng.cpp using nvcc.</w:t>
       </w:r>
     </w:p>
     <w:p>
@@ -2535,7 +2492,7 @@
       <w:r>
         <w:drawing>
           <wp:inline distT="0" distB="0" distL="0" distR="0">
-            <wp:extent cx="5715000" cy="2200275"/>
+            <wp:extent cx="5715000" cy="2781300"/>
             <wp:effectExtent t="0" r="0" b="0" l="0"/>
             <wp:docPr id="16" name="" descr="" title=""/>
             <wp:cNvGraphicFramePr>
@@ -2560,7 +2517,7 @@
                   <pic:spPr bwMode="auto">
                     <a:xfrm>
                       <a:off x="0" y="0"/>
-                      <a:ext cx="5715000" cy="2200275"/>
+                      <a:ext cx="5715000" cy="2781300"/>
                     </a:xfrm>
                     <a:prstGeom prst="rect">
                       <a:avLst/>
@@ -2585,7 +2542,29 @@
           <w:sz w:val="18"/>
           <w:szCs w:val="18"/>
         </w:rPr>
-        <w:t xml:space="preserve">Figure 4.3 — The input photograph beside its edge map: the outlines, tusks and skin texture are traced, while the flat sky is suppressed to black.</w:t>
+        <w:t xml:space="preserve">Figure 4.2 — Processing all six test images in one run, including the 1,200-pixel-wide image; GPU and host memory are freed per image and the batch finishes with 6 processed and 0 skipped.</w:t>
+      </w:r>
+    </w:p>
+    <w:p>
+      <w:pPr>
+        <w:pStyle w:val="Heading2"/>
+        <w:spacing w:after="80" w:before="180"/>
+      </w:pPr>
+      <w:r>
+        <w:rPr>
+          <w:b/>
+          <w:bCs/>
+          <w:color w:val="1F4E79"/>
+        </w:rPr>
+        <w:t xml:space="preserve">The kernel, borders and the grid</w:t>
+      </w:r>
+    </w:p>
+    <w:p>
+      <w:pPr>
+        <w:spacing w:after="120"/>
+      </w:pPr>
+      <w:r>
+        <w:t xml:space="preserve">Each thread computes one output pixel, identified from its block and thread indices in both x and y, since an image is naturally two-dimensional. The 3×3 neighbourhood around the pixel is read in a single pass, accumulating Gx and Gy together, and the edge strength is their combined magnitude, the square root of Gx² + Gy², clamped to the maximum value of 255. The image borders are handled with zero padding, exactly as the brief describes: when a neighbour would fall outside the image, its value is simply treated as zero instead of being read from memory, so the same code handles edge pixels and interior pixels alike with no special case. A fixed 16×16 block size is used and the grid dimensions are calculated from each image's actual width and height, so a single program handles images of any size — including the 1,200-pixel-wide test image above, which exceeds the 1,024-thread limit of a single block and so could not be processed by a launch that maps one thread to each pixel in a single row.</w:t>
       </w:r>
     </w:p>
     <w:p>
@@ -2595,7 +2574,7 @@
       <w:r>
         <w:drawing>
           <wp:inline distT="0" distB="0" distL="0" distR="0">
-            <wp:extent cx="4810125" cy="4076700"/>
+            <wp:extent cx="5715000" cy="2200275"/>
             <wp:effectExtent t="0" r="0" b="0" l="0"/>
             <wp:docPr id="17" name="" descr="" title=""/>
             <wp:cNvGraphicFramePr>
@@ -2612,6 +2591,66 @@
                   </pic:nvPicPr>
                   <pic:blipFill>
                     <a:blip r:embed="rId27" cstate="none"/>
+                    <a:srcRect/>
+                    <a:stretch>
+                      <a:fillRect/>
+                    </a:stretch>
+                  </pic:blipFill>
+                  <pic:spPr bwMode="auto">
+                    <a:xfrm>
+                      <a:off x="0" y="0"/>
+                      <a:ext cx="5715000" cy="2200275"/>
+                    </a:xfrm>
+                    <a:prstGeom prst="rect">
+                      <a:avLst/>
+                    </a:prstGeom>
+                  </pic:spPr>
+                </pic:pic>
+              </a:graphicData>
+            </a:graphic>
+          </wp:inline>
+        </w:drawing>
+      </w:r>
+    </w:p>
+    <w:p>
+      <w:pPr>
+        <w:spacing w:after="160"/>
+      </w:pPr>
+      <w:r>
+        <w:rPr>
+          <w:i/>
+          <w:iCs/>
+          <w:color w:val="595959"/>
+          <w:sz w:val="18"/>
+          <w:szCs w:val="18"/>
+        </w:rPr>
+        <w:t xml:space="preserve">Figure 4.3 — The input photograph beside its edge map: the outlines, tusks and skin texture are traced, while the flat sky is suppressed to black.</w:t>
+      </w:r>
+    </w:p>
+    <w:p>
+      <w:pPr>
+        <w:spacing w:after="20" w:before="80"/>
+      </w:pPr>
+      <w:r>
+        <w:drawing>
+          <wp:inline distT="0" distB="0" distL="0" distR="0">
+            <wp:extent cx="4810125" cy="4076700"/>
+            <wp:effectExtent t="0" r="0" b="0" l="0"/>
+            <wp:docPr id="18" name="" descr="" title=""/>
+            <wp:cNvGraphicFramePr>
+              <a:graphicFrameLocks xmlns:a="http://schemas.openxmlformats.org/drawingml/2006/main" noChangeAspect="1"/>
+            </wp:cNvGraphicFramePr>
+            <a:graphic xmlns:a="http://schemas.openxmlformats.org/drawingml/2006/main">
+              <a:graphicData uri="http://schemas.openxmlformats.org/drawingml/2006/picture">
+                <pic:pic xmlns:pic="http://schemas.openxmlformats.org/drawingml/2006/picture">
+                  <pic:nvPicPr>
+                    <pic:cNvPr id="0" name="" descr=""/>
+                    <pic:cNvPicPr>
+                      <a:picLocks noChangeAspect="1" noChangeArrowheads="1"/>
+                    </pic:cNvPicPr>
+                  </pic:nvPicPr>
+                  <pic:blipFill>
+                    <a:blip r:embed="rId28" cstate="none"/>
                     <a:srcRect/>
                     <a:stretch>
                       <a:fillRect/>

</xml_diff>